<commit_message>
cambios de diagrama y docs
</commit_message>
<xml_diff>
--- a/docs/guia_materiales_taller1.docx
+++ b/docs/guia_materiales_taller1.docx
@@ -82,7 +82,77 @@
         <w:rPr>
           <w:color w:val="000000"/>
         </w:rPr>
-        <w:t>Este documento describe los materiales del Taller 1 del curso, centrado en el diseño e implementación de una tarea de categorización de expresiones emocionales en PsychoPy Builder. La tarea es una adaptación del Experimento 1 de Calvo &amp; Lundqvist (2008), en condiciones de visualización libre (free-viewing), utilizando el Ulima Emotional Faces Dataset como fuente de estímulos.</w:t>
+        <w:t xml:space="preserve">Este documento describe los materiales del Taller 1 del curso, centrado en el diseño e implementación de una tarea de categorización de expresiones emocionales en </w:t>
+      </w:r>
+      <w:proofErr w:type="spellStart"/>
+      <w:r>
+        <w:rPr>
+          <w:color w:val="000000"/>
+        </w:rPr>
+        <w:t>PsychoPy</w:t>
+      </w:r>
+      <w:proofErr w:type="spellEnd"/>
+      <w:r>
+        <w:rPr>
+          <w:color w:val="000000"/>
+        </w:rPr>
+        <w:t xml:space="preserve"> </w:t>
+      </w:r>
+      <w:proofErr w:type="spellStart"/>
+      <w:r>
+        <w:rPr>
+          <w:color w:val="000000"/>
+        </w:rPr>
+        <w:t>Builder</w:t>
+      </w:r>
+      <w:proofErr w:type="spellEnd"/>
+      <w:r>
+        <w:rPr>
+          <w:color w:val="000000"/>
+        </w:rPr>
+        <w:t>. La tarea es una adaptación del Experimento 1 de Calvo &amp; Lundqvist (2008), en condiciones de visualización libre (free-</w:t>
+      </w:r>
+      <w:proofErr w:type="spellStart"/>
+      <w:r>
+        <w:rPr>
+          <w:color w:val="000000"/>
+        </w:rPr>
+        <w:t>viewing</w:t>
+      </w:r>
+      <w:proofErr w:type="spellEnd"/>
+      <w:r>
+        <w:rPr>
+          <w:color w:val="000000"/>
+        </w:rPr>
+        <w:t xml:space="preserve">), utilizando el Ulima </w:t>
+      </w:r>
+      <w:proofErr w:type="spellStart"/>
+      <w:r>
+        <w:rPr>
+          <w:color w:val="000000"/>
+        </w:rPr>
+        <w:t>Emotional</w:t>
+      </w:r>
+      <w:proofErr w:type="spellEnd"/>
+      <w:r>
+        <w:rPr>
+          <w:color w:val="000000"/>
+        </w:rPr>
+        <w:t xml:space="preserve"> Faces </w:t>
+      </w:r>
+      <w:proofErr w:type="spellStart"/>
+      <w:r>
+        <w:rPr>
+          <w:color w:val="000000"/>
+        </w:rPr>
+        <w:t>Dataset</w:t>
+      </w:r>
+      <w:proofErr w:type="spellEnd"/>
+      <w:r>
+        <w:rPr>
+          <w:color w:val="000000"/>
+        </w:rPr>
+        <w:t xml:space="preserve"> como fuente de estímulos.</w:t>
       </w:r>
     </w:p>
     <w:p>
@@ -168,7 +238,21 @@
           <w:color w:val="000000"/>
         </w:rPr>
         <w:tab/>
-        <w:t>Seleccionar Download ZIP.</w:t>
+        <w:t xml:space="preserve">Seleccionar </w:t>
+      </w:r>
+      <w:proofErr w:type="spellStart"/>
+      <w:r>
+        <w:rPr>
+          <w:color w:val="000000"/>
+        </w:rPr>
+        <w:t>Download</w:t>
+      </w:r>
+      <w:proofErr w:type="spellEnd"/>
+      <w:r>
+        <w:rPr>
+          <w:color w:val="000000"/>
+        </w:rPr>
+        <w:t xml:space="preserve"> ZIP.</w:t>
       </w:r>
     </w:p>
     <w:p>
@@ -208,7 +292,57 @@
           <w:color w:val="000000"/>
         </w:rPr>
         <w:tab/>
-        <w:t>Abrir PsychoPy Builder y cargar el archivo categorizacion_emocional.psyexp.</w:t>
+        <w:t xml:space="preserve">Abrir </w:t>
+      </w:r>
+      <w:proofErr w:type="spellStart"/>
+      <w:r>
+        <w:rPr>
+          <w:color w:val="000000"/>
+        </w:rPr>
+        <w:t>PsychoPy</w:t>
+      </w:r>
+      <w:proofErr w:type="spellEnd"/>
+      <w:r>
+        <w:rPr>
+          <w:color w:val="000000"/>
+        </w:rPr>
+        <w:t xml:space="preserve"> </w:t>
+      </w:r>
+      <w:proofErr w:type="spellStart"/>
+      <w:r>
+        <w:rPr>
+          <w:color w:val="000000"/>
+        </w:rPr>
+        <w:t>Builder</w:t>
+      </w:r>
+      <w:proofErr w:type="spellEnd"/>
+      <w:r>
+        <w:rPr>
+          <w:color w:val="000000"/>
+        </w:rPr>
+        <w:t xml:space="preserve"> y cargar el archivo </w:t>
+      </w:r>
+      <w:proofErr w:type="spellStart"/>
+      <w:r>
+        <w:rPr>
+          <w:color w:val="000000"/>
+        </w:rPr>
+        <w:t>categorizacion_</w:t>
+      </w:r>
+      <w:proofErr w:type="gramStart"/>
+      <w:r>
+        <w:rPr>
+          <w:color w:val="000000"/>
+        </w:rPr>
+        <w:t>emocional.psyexp</w:t>
+      </w:r>
+      <w:proofErr w:type="spellEnd"/>
+      <w:proofErr w:type="gramEnd"/>
+      <w:r>
+        <w:rPr>
+          <w:color w:val="000000"/>
+        </w:rPr>
+        <w:t>.</w:t>
       </w:r>
     </w:p>
     <w:p>
@@ -276,7 +410,25 @@
                 <w:sz w:val="22"/>
                 <w:szCs w:val="22"/>
               </w:rPr>
-              <w:t>No mover ni renombrar ninguna carpeta. PsychoPy necesita encontrar los archivos exactamente en las rutas que se configurarán durante el taller.</w:t>
+              <w:t xml:space="preserve">No mover ni renombrar ninguna carpeta. </w:t>
+            </w:r>
+            <w:proofErr w:type="spellStart"/>
+            <w:r>
+              <w:rPr>
+                <w:color w:val="000000"/>
+                <w:sz w:val="22"/>
+                <w:szCs w:val="22"/>
+              </w:rPr>
+              <w:t>PsychoPy</w:t>
+            </w:r>
+            <w:proofErr w:type="spellEnd"/>
+            <w:r>
+              <w:rPr>
+                <w:color w:val="000000"/>
+                <w:sz w:val="22"/>
+                <w:szCs w:val="22"/>
+              </w:rPr>
+              <w:t xml:space="preserve"> necesita encontrar los archivos exactamente en las rutas que se configurarán durante el taller.</w:t>
             </w:r>
           </w:p>
         </w:tc>
@@ -385,8 +537,30 @@
                 <w:sz w:val="20"/>
                 <w:szCs w:val="20"/>
               </w:rPr>
-              <w:t>├── categorizacion_emocional.psyexp</w:t>
-            </w:r>
+              <w:t xml:space="preserve">├── </w:t>
+            </w:r>
+            <w:proofErr w:type="spellStart"/>
+            <w:r>
+              <w:rPr>
+                <w:rFonts w:ascii="Courier New" w:eastAsia="Courier New" w:hAnsi="Courier New" w:cs="Courier New"/>
+                <w:color w:val="000000"/>
+                <w:sz w:val="20"/>
+                <w:szCs w:val="20"/>
+              </w:rPr>
+              <w:t>categorizacion_</w:t>
+            </w:r>
+            <w:proofErr w:type="gramStart"/>
+            <w:r>
+              <w:rPr>
+                <w:rFonts w:ascii="Courier New" w:eastAsia="Courier New" w:hAnsi="Courier New" w:cs="Courier New"/>
+                <w:color w:val="000000"/>
+                <w:sz w:val="20"/>
+                <w:szCs w:val="20"/>
+              </w:rPr>
+              <w:t>emocional.psyexp</w:t>
+            </w:r>
+            <w:proofErr w:type="spellEnd"/>
+            <w:proofErr w:type="gramEnd"/>
           </w:p>
           <w:p>
             <w:pPr>
@@ -413,7 +587,27 @@
                 <w:sz w:val="20"/>
                 <w:szCs w:val="20"/>
               </w:rPr>
-              <w:t>├── conditions/</w:t>
+              <w:t xml:space="preserve">├── </w:t>
+            </w:r>
+            <w:proofErr w:type="spellStart"/>
+            <w:r>
+              <w:rPr>
+                <w:rFonts w:ascii="Courier New" w:eastAsia="Courier New" w:hAnsi="Courier New" w:cs="Courier New"/>
+                <w:color w:val="000000"/>
+                <w:sz w:val="20"/>
+                <w:szCs w:val="20"/>
+              </w:rPr>
+              <w:t>conditions</w:t>
+            </w:r>
+            <w:proofErr w:type="spellEnd"/>
+            <w:r>
+              <w:rPr>
+                <w:rFonts w:ascii="Courier New" w:eastAsia="Courier New" w:hAnsi="Courier New" w:cs="Courier New"/>
+                <w:color w:val="000000"/>
+                <w:sz w:val="20"/>
+                <w:szCs w:val="20"/>
+              </w:rPr>
+              <w:t>/</w:t>
             </w:r>
           </w:p>
           <w:p>
@@ -427,7 +621,47 @@
                 <w:sz w:val="20"/>
                 <w:szCs w:val="20"/>
               </w:rPr>
-              <w:t xml:space="preserve">│   ├── condiciones_experimental.xlsx   (40 trials </w:t>
+              <w:t>│   ├── condiciones_experimental.xlsx</w:t>
+            </w:r>
+            <w:proofErr w:type="gramStart"/>
+            <w:r>
+              <w:rPr>
+                <w:rFonts w:ascii="Courier New" w:eastAsia="Courier New" w:hAnsi="Courier New" w:cs="Courier New"/>
+                <w:color w:val="000000"/>
+                <w:sz w:val="20"/>
+                <w:szCs w:val="20"/>
+              </w:rPr>
+              <w:t xml:space="preserve">   (</w:t>
+            </w:r>
+            <w:proofErr w:type="gramEnd"/>
+            <w:r>
+              <w:rPr>
+                <w:rFonts w:ascii="Courier New" w:eastAsia="Courier New" w:hAnsi="Courier New" w:cs="Courier New"/>
+                <w:color w:val="000000"/>
+                <w:sz w:val="20"/>
+                <w:szCs w:val="20"/>
+              </w:rPr>
+              <w:t xml:space="preserve">40 </w:t>
+            </w:r>
+            <w:proofErr w:type="spellStart"/>
+            <w:r>
+              <w:rPr>
+                <w:rFonts w:ascii="Courier New" w:eastAsia="Courier New" w:hAnsi="Courier New" w:cs="Courier New"/>
+                <w:color w:val="000000"/>
+                <w:sz w:val="20"/>
+                <w:szCs w:val="20"/>
+              </w:rPr>
+              <w:t>trials</w:t>
+            </w:r>
+            <w:proofErr w:type="spellEnd"/>
+            <w:r>
+              <w:rPr>
+                <w:rFonts w:ascii="Courier New" w:eastAsia="Courier New" w:hAnsi="Courier New" w:cs="Courier New"/>
+                <w:color w:val="000000"/>
+                <w:sz w:val="20"/>
+                <w:szCs w:val="20"/>
+              </w:rPr>
+              <w:t xml:space="preserve"> </w:t>
             </w:r>
             <w:r>
               <w:rPr>
@@ -459,7 +693,47 @@
                 <w:sz w:val="20"/>
                 <w:szCs w:val="20"/>
               </w:rPr>
-              <w:t xml:space="preserve">│   └── condiciones_practica.xlsx        (12 trials </w:t>
+              <w:t xml:space="preserve">│   └── condiciones_practica.xlsx     </w:t>
+            </w:r>
+            <w:proofErr w:type="gramStart"/>
+            <w:r>
+              <w:rPr>
+                <w:rFonts w:ascii="Courier New" w:eastAsia="Courier New" w:hAnsi="Courier New" w:cs="Courier New"/>
+                <w:color w:val="000000"/>
+                <w:sz w:val="20"/>
+                <w:szCs w:val="20"/>
+              </w:rPr>
+              <w:t xml:space="preserve">   (</w:t>
+            </w:r>
+            <w:proofErr w:type="gramEnd"/>
+            <w:r>
+              <w:rPr>
+                <w:rFonts w:ascii="Courier New" w:eastAsia="Courier New" w:hAnsi="Courier New" w:cs="Courier New"/>
+                <w:color w:val="000000"/>
+                <w:sz w:val="20"/>
+                <w:szCs w:val="20"/>
+              </w:rPr>
+              <w:t xml:space="preserve">12 </w:t>
+            </w:r>
+            <w:proofErr w:type="spellStart"/>
+            <w:r>
+              <w:rPr>
+                <w:rFonts w:ascii="Courier New" w:eastAsia="Courier New" w:hAnsi="Courier New" w:cs="Courier New"/>
+                <w:color w:val="000000"/>
+                <w:sz w:val="20"/>
+                <w:szCs w:val="20"/>
+              </w:rPr>
+              <w:t>trials</w:t>
+            </w:r>
+            <w:proofErr w:type="spellEnd"/>
+            <w:r>
+              <w:rPr>
+                <w:rFonts w:ascii="Courier New" w:eastAsia="Courier New" w:hAnsi="Courier New" w:cs="Courier New"/>
+                <w:color w:val="000000"/>
+                <w:sz w:val="20"/>
+                <w:szCs w:val="20"/>
+              </w:rPr>
+              <w:t xml:space="preserve"> </w:t>
             </w:r>
             <w:r>
               <w:rPr>
@@ -511,7 +785,27 @@
                 <w:sz w:val="20"/>
                 <w:szCs w:val="20"/>
               </w:rPr>
-              <w:t>├── docs/</w:t>
+              <w:t xml:space="preserve">├── </w:t>
+            </w:r>
+            <w:proofErr w:type="spellStart"/>
+            <w:r>
+              <w:rPr>
+                <w:rFonts w:ascii="Courier New" w:eastAsia="Courier New" w:hAnsi="Courier New" w:cs="Courier New"/>
+                <w:color w:val="000000"/>
+                <w:sz w:val="20"/>
+                <w:szCs w:val="20"/>
+              </w:rPr>
+              <w:t>docs</w:t>
+            </w:r>
+            <w:proofErr w:type="spellEnd"/>
+            <w:r>
+              <w:rPr>
+                <w:rFonts w:ascii="Courier New" w:eastAsia="Courier New" w:hAnsi="Courier New" w:cs="Courier New"/>
+                <w:color w:val="000000"/>
+                <w:sz w:val="20"/>
+                <w:szCs w:val="20"/>
+              </w:rPr>
+              <w:t>/</w:t>
             </w:r>
           </w:p>
           <w:p>
@@ -598,7 +892,29 @@
                 <w:szCs w:val="20"/>
                 <w:lang w:val="en-US"/>
               </w:rPr>
-              <w:t>│   ├── anger/       (anger_01.png … anger_40.png)</w:t>
+              <w:t xml:space="preserve">│   ├── anger/    </w:t>
+            </w:r>
+            <w:proofErr w:type="gramStart"/>
+            <w:r>
+              <w:rPr>
+                <w:rFonts w:ascii="Courier New" w:eastAsia="Courier New" w:hAnsi="Courier New" w:cs="Courier New"/>
+                <w:color w:val="000000"/>
+                <w:sz w:val="20"/>
+                <w:szCs w:val="20"/>
+                <w:lang w:val="en-US"/>
+              </w:rPr>
+              <w:t xml:space="preserve">   (</w:t>
+            </w:r>
+            <w:proofErr w:type="gramEnd"/>
+            <w:r>
+              <w:rPr>
+                <w:rFonts w:ascii="Courier New" w:eastAsia="Courier New" w:hAnsi="Courier New" w:cs="Courier New"/>
+                <w:color w:val="000000"/>
+                <w:sz w:val="20"/>
+                <w:szCs w:val="20"/>
+                <w:lang w:val="en-US"/>
+              </w:rPr>
+              <w:t>anger_01.png … anger_40.png)</w:t>
             </w:r>
           </w:p>
           <w:p>
@@ -616,7 +932,29 @@
                 <w:szCs w:val="20"/>
                 <w:lang w:val="en-US"/>
               </w:rPr>
-              <w:t>│   ├── fear/        (fear_01.png … fear_40.png)</w:t>
+              <w:t xml:space="preserve">│   ├── fear/     </w:t>
+            </w:r>
+            <w:proofErr w:type="gramStart"/>
+            <w:r>
+              <w:rPr>
+                <w:rFonts w:ascii="Courier New" w:eastAsia="Courier New" w:hAnsi="Courier New" w:cs="Courier New"/>
+                <w:color w:val="000000"/>
+                <w:sz w:val="20"/>
+                <w:szCs w:val="20"/>
+                <w:lang w:val="en-US"/>
+              </w:rPr>
+              <w:t xml:space="preserve">   (</w:t>
+            </w:r>
+            <w:proofErr w:type="gramEnd"/>
+            <w:r>
+              <w:rPr>
+                <w:rFonts w:ascii="Courier New" w:eastAsia="Courier New" w:hAnsi="Courier New" w:cs="Courier New"/>
+                <w:color w:val="000000"/>
+                <w:sz w:val="20"/>
+                <w:szCs w:val="20"/>
+                <w:lang w:val="en-US"/>
+              </w:rPr>
+              <w:t>fear_01.png … fear_40.png)</w:t>
             </w:r>
           </w:p>
           <w:p>
@@ -634,7 +972,29 @@
                 <w:szCs w:val="20"/>
                 <w:lang w:val="en-US"/>
               </w:rPr>
-              <w:t>│   ├── happiness/   (happiness_01.png … happiness_40.png)</w:t>
+              <w:t>│   ├── happiness/</w:t>
+            </w:r>
+            <w:proofErr w:type="gramStart"/>
+            <w:r>
+              <w:rPr>
+                <w:rFonts w:ascii="Courier New" w:eastAsia="Courier New" w:hAnsi="Courier New" w:cs="Courier New"/>
+                <w:color w:val="000000"/>
+                <w:sz w:val="20"/>
+                <w:szCs w:val="20"/>
+                <w:lang w:val="en-US"/>
+              </w:rPr>
+              <w:t xml:space="preserve">   (</w:t>
+            </w:r>
+            <w:proofErr w:type="gramEnd"/>
+            <w:r>
+              <w:rPr>
+                <w:rFonts w:ascii="Courier New" w:eastAsia="Courier New" w:hAnsi="Courier New" w:cs="Courier New"/>
+                <w:color w:val="000000"/>
+                <w:sz w:val="20"/>
+                <w:szCs w:val="20"/>
+                <w:lang w:val="en-US"/>
+              </w:rPr>
+              <w:t>happiness_01.png … happiness_40.png)</w:t>
             </w:r>
           </w:p>
           <w:p>
@@ -652,7 +1012,29 @@
                 <w:szCs w:val="20"/>
                 <w:lang w:val="en-US"/>
               </w:rPr>
-              <w:t>│   ├── sadness/     (sadness_01.png … sadness_40.png)</w:t>
+              <w:t xml:space="preserve">│   ├── sadness/  </w:t>
+            </w:r>
+            <w:proofErr w:type="gramStart"/>
+            <w:r>
+              <w:rPr>
+                <w:rFonts w:ascii="Courier New" w:eastAsia="Courier New" w:hAnsi="Courier New" w:cs="Courier New"/>
+                <w:color w:val="000000"/>
+                <w:sz w:val="20"/>
+                <w:szCs w:val="20"/>
+                <w:lang w:val="en-US"/>
+              </w:rPr>
+              <w:t xml:space="preserve">   (</w:t>
+            </w:r>
+            <w:proofErr w:type="gramEnd"/>
+            <w:r>
+              <w:rPr>
+                <w:rFonts w:ascii="Courier New" w:eastAsia="Courier New" w:hAnsi="Courier New" w:cs="Courier New"/>
+                <w:color w:val="000000"/>
+                <w:sz w:val="20"/>
+                <w:szCs w:val="20"/>
+                <w:lang w:val="en-US"/>
+              </w:rPr>
+              <w:t>sadness_01.png … sadness_40.png)</w:t>
             </w:r>
           </w:p>
           <w:p>
@@ -667,7 +1049,27 @@
                 <w:szCs w:val="20"/>
               </w:rPr>
               <w:lastRenderedPageBreak/>
-              <w:t>│   └── practice/</w:t>
+              <w:t xml:space="preserve">│   └── </w:t>
+            </w:r>
+            <w:proofErr w:type="spellStart"/>
+            <w:r>
+              <w:rPr>
+                <w:rFonts w:ascii="Courier New" w:eastAsia="Courier New" w:hAnsi="Courier New" w:cs="Courier New"/>
+                <w:color w:val="000000"/>
+                <w:sz w:val="20"/>
+                <w:szCs w:val="20"/>
+              </w:rPr>
+              <w:t>practice</w:t>
+            </w:r>
+            <w:proofErr w:type="spellEnd"/>
+            <w:r>
+              <w:rPr>
+                <w:rFonts w:ascii="Courier New" w:eastAsia="Courier New" w:hAnsi="Courier New" w:cs="Courier New"/>
+                <w:color w:val="000000"/>
+                <w:sz w:val="20"/>
+                <w:szCs w:val="20"/>
+              </w:rPr>
+              <w:t>/</w:t>
             </w:r>
           </w:p>
           <w:p>
@@ -893,13 +1295,23 @@
             <w:pPr>
               <w:jc w:val="both"/>
             </w:pPr>
-            <w:r>
-              <w:rPr>
-                <w:color w:val="000000"/>
-                <w:sz w:val="22"/>
-                <w:szCs w:val="22"/>
-              </w:rPr>
-              <w:t>Forced-choice, categorización emocional</w:t>
+            <w:proofErr w:type="spellStart"/>
+            <w:r>
+              <w:rPr>
+                <w:color w:val="000000"/>
+                <w:sz w:val="22"/>
+                <w:szCs w:val="22"/>
+              </w:rPr>
+              <w:t>Forced-choice</w:t>
+            </w:r>
+            <w:proofErr w:type="spellEnd"/>
+            <w:r>
+              <w:rPr>
+                <w:color w:val="000000"/>
+                <w:sz w:val="22"/>
+                <w:szCs w:val="22"/>
+              </w:rPr>
+              <w:t>, categorización emocional</w:t>
             </w:r>
           </w:p>
         </w:tc>
@@ -1027,7 +1439,61 @@
                 <w:sz w:val="22"/>
                 <w:szCs w:val="22"/>
               </w:rPr>
-              <w:t>F (alegría)  ·  G (tristeza)  ·  H (ira)  ·  J (miedo)</w:t>
+              <w:t>F (</w:t>
+            </w:r>
+            <w:proofErr w:type="gramStart"/>
+            <w:r>
+              <w:rPr>
+                <w:color w:val="000000"/>
+                <w:sz w:val="22"/>
+                <w:szCs w:val="22"/>
+              </w:rPr>
+              <w:t>alegría)  ·</w:t>
+            </w:r>
+            <w:proofErr w:type="gramEnd"/>
+            <w:r>
+              <w:rPr>
+                <w:color w:val="000000"/>
+                <w:sz w:val="22"/>
+                <w:szCs w:val="22"/>
+              </w:rPr>
+              <w:t xml:space="preserve">  G (</w:t>
+            </w:r>
+            <w:proofErr w:type="gramStart"/>
+            <w:r>
+              <w:rPr>
+                <w:color w:val="000000"/>
+                <w:sz w:val="22"/>
+                <w:szCs w:val="22"/>
+              </w:rPr>
+              <w:t>tristeza)  ·</w:t>
+            </w:r>
+            <w:proofErr w:type="gramEnd"/>
+            <w:r>
+              <w:rPr>
+                <w:color w:val="000000"/>
+                <w:sz w:val="22"/>
+                <w:szCs w:val="22"/>
+              </w:rPr>
+              <w:t xml:space="preserve">  H (</w:t>
+            </w:r>
+            <w:proofErr w:type="gramStart"/>
+            <w:r>
+              <w:rPr>
+                <w:color w:val="000000"/>
+                <w:sz w:val="22"/>
+                <w:szCs w:val="22"/>
+              </w:rPr>
+              <w:t>ira)  ·</w:t>
+            </w:r>
+            <w:proofErr w:type="gramEnd"/>
+            <w:r>
+              <w:rPr>
+                <w:color w:val="000000"/>
+                <w:sz w:val="22"/>
+                <w:szCs w:val="22"/>
+              </w:rPr>
+              <w:t xml:space="preserve">  J (miedo)</w:t>
             </w:r>
           </w:p>
         </w:tc>
@@ -1054,13 +1520,23 @@
             <w:pPr>
               <w:jc w:val="both"/>
             </w:pPr>
-            <w:r>
-              <w:rPr>
-                <w:color w:val="000000"/>
-                <w:sz w:val="22"/>
-                <w:szCs w:val="22"/>
-              </w:rPr>
-              <w:t>Trials de práctica</w:t>
+            <w:proofErr w:type="spellStart"/>
+            <w:r>
+              <w:rPr>
+                <w:color w:val="000000"/>
+                <w:sz w:val="22"/>
+                <w:szCs w:val="22"/>
+              </w:rPr>
+              <w:t>Trials</w:t>
+            </w:r>
+            <w:proofErr w:type="spellEnd"/>
+            <w:r>
+              <w:rPr>
+                <w:color w:val="000000"/>
+                <w:sz w:val="22"/>
+                <w:szCs w:val="22"/>
+              </w:rPr>
+              <w:t xml:space="preserve"> de práctica</w:t>
             </w:r>
           </w:p>
         </w:tc>
@@ -1118,13 +1594,23 @@
             <w:pPr>
               <w:jc w:val="both"/>
             </w:pPr>
-            <w:r>
-              <w:rPr>
-                <w:color w:val="000000"/>
-                <w:sz w:val="22"/>
-                <w:szCs w:val="22"/>
-              </w:rPr>
-              <w:t>Trials experimentales</w:t>
+            <w:proofErr w:type="spellStart"/>
+            <w:r>
+              <w:rPr>
+                <w:color w:val="000000"/>
+                <w:sz w:val="22"/>
+                <w:szCs w:val="22"/>
+              </w:rPr>
+              <w:t>Trials</w:t>
+            </w:r>
+            <w:proofErr w:type="spellEnd"/>
+            <w:r>
+              <w:rPr>
+                <w:color w:val="000000"/>
+                <w:sz w:val="22"/>
+                <w:szCs w:val="22"/>
+              </w:rPr>
+              <w:t xml:space="preserve"> experimentales</w:t>
             </w:r>
           </w:p>
         </w:tc>
@@ -1219,7 +1705,25 @@
                 <w:sz w:val="22"/>
                 <w:szCs w:val="22"/>
               </w:rPr>
-              <w:t>Free-viewing (hasta respuesta del participante)</w:t>
+              <w:t>Free-</w:t>
+            </w:r>
+            <w:proofErr w:type="spellStart"/>
+            <w:r>
+              <w:rPr>
+                <w:color w:val="000000"/>
+                <w:sz w:val="22"/>
+                <w:szCs w:val="22"/>
+              </w:rPr>
+              <w:t>viewing</w:t>
+            </w:r>
+            <w:proofErr w:type="spellEnd"/>
+            <w:r>
+              <w:rPr>
+                <w:color w:val="000000"/>
+                <w:sz w:val="22"/>
+                <w:szCs w:val="22"/>
+              </w:rPr>
+              <w:t xml:space="preserve"> (hasta respuesta del participante)</w:t>
             </w:r>
           </w:p>
         </w:tc>
@@ -1310,6 +1814,7 @@
             <w:pPr>
               <w:jc w:val="both"/>
             </w:pPr>
+            <w:proofErr w:type="spellStart"/>
             <w:r>
               <w:rPr>
                 <w:color w:val="000000"/>
@@ -1318,6 +1823,7 @@
               </w:rPr>
               <w:t>Feedback</w:t>
             </w:r>
+            <w:proofErr w:type="spellEnd"/>
           </w:p>
         </w:tc>
         <w:tc>
@@ -1446,7 +1952,25 @@
           <w:sz w:val="20"/>
           <w:szCs w:val="20"/>
         </w:rPr>
-        <w:t>El RT se registra en milisegundos. El promedio de RT se calcula únicamente sobre los trials correctos.</w:t>
+        <w:t xml:space="preserve">El RT se registra en milisegundos. El promedio de RT se calcula únicamente sobre los </w:t>
+      </w:r>
+      <w:proofErr w:type="spellStart"/>
+      <w:r>
+        <w:rPr>
+          <w:color w:val="000000"/>
+          <w:sz w:val="20"/>
+          <w:szCs w:val="20"/>
+        </w:rPr>
+        <w:t>trials</w:t>
+      </w:r>
+      <w:proofErr w:type="spellEnd"/>
+      <w:r>
+        <w:rPr>
+          <w:color w:val="000000"/>
+          <w:sz w:val="20"/>
+          <w:szCs w:val="20"/>
+        </w:rPr>
+        <w:t xml:space="preserve"> correctos.</w:t>
       </w:r>
     </w:p>
     <w:p>
@@ -1460,8 +1984,16 @@
         <w:rPr>
           <w:color w:val="000000"/>
         </w:rPr>
-        <w:t>Flujo de routines</w:t>
-      </w:r>
+        <w:t xml:space="preserve">Flujo de </w:t>
+      </w:r>
+      <w:proofErr w:type="spellStart"/>
+      <w:r>
+        <w:rPr>
+          <w:color w:val="000000"/>
+        </w:rPr>
+        <w:t>routines</w:t>
+      </w:r>
+      <w:proofErr w:type="spellEnd"/>
     </w:p>
     <w:p>
       <w:pPr>
@@ -1492,7 +2024,25 @@
           <w:iCs/>
           <w:color w:val="000000"/>
         </w:rPr>
-        <w:t>Gráfico del flujo de routines de la tarea de categorización emocional</w:t>
+        <w:t xml:space="preserve">Gráfico del flujo de </w:t>
+      </w:r>
+      <w:proofErr w:type="spellStart"/>
+      <w:r>
+        <w:rPr>
+          <w:i/>
+          <w:iCs/>
+          <w:color w:val="000000"/>
+        </w:rPr>
+        <w:t>routines</w:t>
+      </w:r>
+      <w:proofErr w:type="spellEnd"/>
+      <w:r>
+        <w:rPr>
+          <w:i/>
+          <w:iCs/>
+          <w:color w:val="000000"/>
+        </w:rPr>
+        <w:t xml:space="preserve"> de la tarea de categorización emocional</w:t>
       </w:r>
     </w:p>
     <w:p>
@@ -1504,10 +2054,10 @@
           <w:noProof/>
         </w:rPr>
         <w:drawing>
-          <wp:inline distT="0" distB="0" distL="0" distR="0" wp14:anchorId="0FA311EA" wp14:editId="579C251A">
-            <wp:extent cx="5731510" cy="849630"/>
-            <wp:effectExtent l="0" t="0" r="2540" b="7620"/>
-            <wp:docPr id="855453974" name="Imagen 1"/>
+          <wp:inline distT="0" distB="0" distL="0" distR="0" wp14:anchorId="769EAFF2" wp14:editId="1B62D1C7">
+            <wp:extent cx="5731510" cy="945515"/>
+            <wp:effectExtent l="0" t="0" r="2540" b="6985"/>
+            <wp:docPr id="672043739" name="Imagen 1"/>
             <wp:cNvGraphicFramePr>
               <a:graphicFrameLocks xmlns:a="http://schemas.openxmlformats.org/drawingml/2006/main" noChangeAspect="1"/>
             </wp:cNvGraphicFramePr>
@@ -1515,7 +2065,7 @@
               <a:graphicData uri="http://schemas.openxmlformats.org/drawingml/2006/picture">
                 <pic:pic xmlns:pic="http://schemas.openxmlformats.org/drawingml/2006/picture">
                   <pic:nvPicPr>
-                    <pic:cNvPr id="855453974" name="Imagen 855453974"/>
+                    <pic:cNvPr id="672043739" name="Imagen 672043739"/>
                     <pic:cNvPicPr/>
                   </pic:nvPicPr>
                   <pic:blipFill>
@@ -1533,7 +2083,7 @@
                   <pic:spPr>
                     <a:xfrm>
                       <a:off x="0" y="0"/>
-                      <a:ext cx="5731510" cy="849630"/>
+                      <a:ext cx="5731510" cy="945515"/>
                     </a:xfrm>
                     <a:prstGeom prst="rect">
                       <a:avLst/>
@@ -1572,7 +2122,35 @@
         <w:rPr>
           <w:color w:val="000000"/>
         </w:rPr>
-        <w:t>La tarea usa dos archivos de condiciones. A diferencia de la fase experimental, la fase de práctica no utiliza imágenes sino palabras escritas, por lo que cada fase emplea un componente distinto en PsychoPy: Text en práctica e Image en experimental.</w:t>
+        <w:t xml:space="preserve">La tarea usa dos archivos de condiciones. A diferencia de la fase experimental, la fase de práctica no utiliza imágenes sino palabras escritas, por lo que cada fase emplea un componente distinto en </w:t>
+      </w:r>
+      <w:proofErr w:type="spellStart"/>
+      <w:r>
+        <w:rPr>
+          <w:color w:val="000000"/>
+        </w:rPr>
+        <w:t>PsychoPy</w:t>
+      </w:r>
+      <w:proofErr w:type="spellEnd"/>
+      <w:r>
+        <w:rPr>
+          <w:color w:val="000000"/>
+        </w:rPr>
+        <w:t xml:space="preserve">: Text en práctica e </w:t>
+      </w:r>
+      <w:proofErr w:type="spellStart"/>
+      <w:r>
+        <w:rPr>
+          <w:color w:val="000000"/>
+        </w:rPr>
+        <w:t>Image</w:t>
+      </w:r>
+      <w:proofErr w:type="spellEnd"/>
+      <w:r>
+        <w:rPr>
+          <w:color w:val="000000"/>
+        </w:rPr>
+        <w:t xml:space="preserve"> en experimental.</w:t>
       </w:r>
     </w:p>
     <w:p>
@@ -1714,9 +2292,11 @@
             </w:tcMar>
           </w:tcPr>
           <w:p>
+            <w:proofErr w:type="spellStart"/>
             <w:r>
               <w:t>id_p</w:t>
             </w:r>
+            <w:proofErr w:type="spellEnd"/>
           </w:p>
         </w:tc>
         <w:tc>
@@ -1762,6 +2342,7 @@
             </w:tcMar>
           </w:tcPr>
           <w:p>
+            <w:proofErr w:type="spellStart"/>
             <w:r>
               <w:rPr>
                 <w:color w:val="000000"/>
@@ -1771,6 +2352,7 @@
               <w:lastRenderedPageBreak/>
               <w:t>palabra_p</w:t>
             </w:r>
+            <w:proofErr w:type="spellEnd"/>
           </w:p>
         </w:tc>
         <w:tc>
@@ -1819,6 +2401,7 @@
             </w:tcMar>
           </w:tcPr>
           <w:p>
+            <w:proofErr w:type="spellStart"/>
             <w:r>
               <w:rPr>
                 <w:color w:val="000000"/>
@@ -1827,6 +2410,7 @@
               </w:rPr>
               <w:t>emocion_p</w:t>
             </w:r>
+            <w:proofErr w:type="spellEnd"/>
           </w:p>
         </w:tc>
         <w:tc>
@@ -1872,6 +2456,7 @@
             </w:tcMar>
           </w:tcPr>
           <w:p>
+            <w:proofErr w:type="spellStart"/>
             <w:r>
               <w:rPr>
                 <w:color w:val="000000"/>
@@ -1880,6 +2465,7 @@
               </w:rPr>
               <w:t>tecla_correcta_p</w:t>
             </w:r>
+            <w:proofErr w:type="spellEnd"/>
           </w:p>
         </w:tc>
         <w:tc>
@@ -1928,7 +2514,61 @@
           <w:sz w:val="20"/>
           <w:szCs w:val="20"/>
         </w:rPr>
-        <w:t>En la fase de práctica el estímulo es una palabra escrita, no una imagen. El componente Text debe tener: Text = $palabra_p | Set every repeat activado.</w:t>
+        <w:t>En la fase de práctica el estímulo es una palabra escrita, no una imagen. El componente Text debe tener: Text = $</w:t>
+      </w:r>
+      <w:proofErr w:type="spellStart"/>
+      <w:r>
+        <w:rPr>
+          <w:color w:val="000000"/>
+          <w:sz w:val="20"/>
+          <w:szCs w:val="20"/>
+        </w:rPr>
+        <w:t>palabra_p</w:t>
+      </w:r>
+      <w:proofErr w:type="spellEnd"/>
+      <w:r>
+        <w:rPr>
+          <w:color w:val="000000"/>
+          <w:sz w:val="20"/>
+          <w:szCs w:val="20"/>
+        </w:rPr>
+        <w:t xml:space="preserve"> | Set </w:t>
+      </w:r>
+      <w:proofErr w:type="spellStart"/>
+      <w:r>
+        <w:rPr>
+          <w:color w:val="000000"/>
+          <w:sz w:val="20"/>
+          <w:szCs w:val="20"/>
+        </w:rPr>
+        <w:t>every</w:t>
+      </w:r>
+      <w:proofErr w:type="spellEnd"/>
+      <w:r>
+        <w:rPr>
+          <w:color w:val="000000"/>
+          <w:sz w:val="20"/>
+          <w:szCs w:val="20"/>
+        </w:rPr>
+        <w:t xml:space="preserve"> </w:t>
+      </w:r>
+      <w:proofErr w:type="spellStart"/>
+      <w:r>
+        <w:rPr>
+          <w:color w:val="000000"/>
+          <w:sz w:val="20"/>
+          <w:szCs w:val="20"/>
+        </w:rPr>
+        <w:t>repeat</w:t>
+      </w:r>
+      <w:proofErr w:type="spellEnd"/>
+      <w:r>
+        <w:rPr>
+          <w:color w:val="000000"/>
+          <w:sz w:val="20"/>
+          <w:szCs w:val="20"/>
+        </w:rPr>
+        <w:t xml:space="preserve"> activado.</w:t>
       </w:r>
     </w:p>
     <w:p>
@@ -2152,7 +2792,15 @@
           </w:tcPr>
           <w:p>
             <w:r>
-              <w:t>Ruta relativa al archivo de imagen del estímulo (ej. media/happiness/happiness_01.png)</w:t>
+              <w:t>Ruta relativa al archivo de imagen del estímulo (ej. media/</w:t>
+            </w:r>
+            <w:proofErr w:type="spellStart"/>
+            <w:r>
+              <w:t>happiness</w:t>
+            </w:r>
+            <w:proofErr w:type="spellEnd"/>
+            <w:r>
+              <w:t>/happiness_01.png)</w:t>
             </w:r>
           </w:p>
         </w:tc>
@@ -2176,6 +2824,7 @@
             </w:tcMar>
           </w:tcPr>
           <w:p>
+            <w:proofErr w:type="spellStart"/>
             <w:r>
               <w:rPr>
                 <w:color w:val="000000"/>
@@ -2184,6 +2833,7 @@
               </w:rPr>
               <w:t>emocion</w:t>
             </w:r>
+            <w:proofErr w:type="spellEnd"/>
           </w:p>
         </w:tc>
         <w:tc>
@@ -2229,6 +2879,7 @@
             </w:tcMar>
           </w:tcPr>
           <w:p>
+            <w:proofErr w:type="spellStart"/>
             <w:r>
               <w:rPr>
                 <w:color w:val="000000"/>
@@ -2237,6 +2888,7 @@
               </w:rPr>
               <w:t>tecla_correcta</w:t>
             </w:r>
+            <w:proofErr w:type="spellEnd"/>
           </w:p>
         </w:tc>
         <w:tc>
@@ -2285,7 +2937,97 @@
           <w:sz w:val="20"/>
           <w:szCs w:val="20"/>
         </w:rPr>
-        <w:t>El componente Image en PsychoPy debe tener: Image = $imagen | Set every repeat activado.</w:t>
+        <w:t xml:space="preserve">El componente </w:t>
+      </w:r>
+      <w:proofErr w:type="spellStart"/>
+      <w:r>
+        <w:rPr>
+          <w:color w:val="000000"/>
+          <w:sz w:val="20"/>
+          <w:szCs w:val="20"/>
+        </w:rPr>
+        <w:t>Image</w:t>
+      </w:r>
+      <w:proofErr w:type="spellEnd"/>
+      <w:r>
+        <w:rPr>
+          <w:color w:val="000000"/>
+          <w:sz w:val="20"/>
+          <w:szCs w:val="20"/>
+        </w:rPr>
+        <w:t xml:space="preserve"> en </w:t>
+      </w:r>
+      <w:proofErr w:type="spellStart"/>
+      <w:r>
+        <w:rPr>
+          <w:color w:val="000000"/>
+          <w:sz w:val="20"/>
+          <w:szCs w:val="20"/>
+        </w:rPr>
+        <w:t>PsychoPy</w:t>
+      </w:r>
+      <w:proofErr w:type="spellEnd"/>
+      <w:r>
+        <w:rPr>
+          <w:color w:val="000000"/>
+          <w:sz w:val="20"/>
+          <w:szCs w:val="20"/>
+        </w:rPr>
+        <w:t xml:space="preserve"> debe tener: </w:t>
+      </w:r>
+      <w:proofErr w:type="spellStart"/>
+      <w:r>
+        <w:rPr>
+          <w:color w:val="000000"/>
+          <w:sz w:val="20"/>
+          <w:szCs w:val="20"/>
+        </w:rPr>
+        <w:t>Image</w:t>
+      </w:r>
+      <w:proofErr w:type="spellEnd"/>
+      <w:r>
+        <w:rPr>
+          <w:color w:val="000000"/>
+          <w:sz w:val="20"/>
+          <w:szCs w:val="20"/>
+        </w:rPr>
+        <w:t xml:space="preserve"> = $imagen | Set </w:t>
+      </w:r>
+      <w:proofErr w:type="spellStart"/>
+      <w:r>
+        <w:rPr>
+          <w:color w:val="000000"/>
+          <w:sz w:val="20"/>
+          <w:szCs w:val="20"/>
+        </w:rPr>
+        <w:t>every</w:t>
+      </w:r>
+      <w:proofErr w:type="spellEnd"/>
+      <w:r>
+        <w:rPr>
+          <w:color w:val="000000"/>
+          <w:sz w:val="20"/>
+          <w:szCs w:val="20"/>
+        </w:rPr>
+        <w:t xml:space="preserve"> </w:t>
+      </w:r>
+      <w:proofErr w:type="spellStart"/>
+      <w:r>
+        <w:rPr>
+          <w:color w:val="000000"/>
+          <w:sz w:val="20"/>
+          <w:szCs w:val="20"/>
+        </w:rPr>
+        <w:t>repeat</w:t>
+      </w:r>
+      <w:proofErr w:type="spellEnd"/>
+      <w:r>
+        <w:rPr>
+          <w:color w:val="000000"/>
+          <w:sz w:val="20"/>
+          <w:szCs w:val="20"/>
+        </w:rPr>
+        <w:t xml:space="preserve"> activado.</w:t>
       </w:r>
     </w:p>
     <w:p>
@@ -2311,7 +3053,35 @@
         <w:rPr>
           <w:color w:val="000000"/>
         </w:rPr>
-        <w:t>Las fotografías provienen del Ulima Emotional Faces Dataset, un banco de imágenes de expresiones emocionales en rostros latinos desarrollado en la Universidad de Lima. Las características de las imágenes son las siguientes:</w:t>
+        <w:t xml:space="preserve">Las fotografías provienen del Ulima </w:t>
+      </w:r>
+      <w:proofErr w:type="spellStart"/>
+      <w:r>
+        <w:rPr>
+          <w:color w:val="000000"/>
+        </w:rPr>
+        <w:t>Emotional</w:t>
+      </w:r>
+      <w:proofErr w:type="spellEnd"/>
+      <w:r>
+        <w:rPr>
+          <w:color w:val="000000"/>
+        </w:rPr>
+        <w:t xml:space="preserve"> Faces </w:t>
+      </w:r>
+      <w:proofErr w:type="spellStart"/>
+      <w:r>
+        <w:rPr>
+          <w:color w:val="000000"/>
+        </w:rPr>
+        <w:t>Dataset</w:t>
+      </w:r>
+      <w:proofErr w:type="spellEnd"/>
+      <w:r>
+        <w:rPr>
+          <w:color w:val="000000"/>
+        </w:rPr>
+        <w:t>, un banco de imágenes de expresiones emocionales en rostros latinos desarrollado en la Universidad de Lima. Las características de las imágenes son las siguientes:</w:t>
       </w:r>
     </w:p>
     <w:p>
@@ -2391,8 +3161,16 @@
           <w:color w:val="000000"/>
         </w:rPr>
         <w:tab/>
-        <w:t>Tamaño estandarizado: 600 × 800 px</w:t>
-      </w:r>
+        <w:t xml:space="preserve">Tamaño estandarizado: 600 × 800 </w:t>
+      </w:r>
+      <w:proofErr w:type="spellStart"/>
+      <w:r>
+        <w:rPr>
+          <w:color w:val="000000"/>
+        </w:rPr>
+        <w:t>px</w:t>
+      </w:r>
+      <w:proofErr w:type="spellEnd"/>
     </w:p>
     <w:p>
       <w:pPr>
@@ -2439,7 +3217,21 @@
         <w:rPr>
           <w:color w:val="000000"/>
         </w:rPr>
-        <w:t>Una vez completada la tarea, el archivo CSV generado automáticamente por PsychoPy puede procesarse en la aplicación web del curso, sin necesidad de instalar ningún software adicional:</w:t>
+        <w:t xml:space="preserve">Una vez completada la tarea, el archivo CSV generado automáticamente por </w:t>
+      </w:r>
+      <w:proofErr w:type="spellStart"/>
+      <w:r>
+        <w:rPr>
+          <w:color w:val="000000"/>
+        </w:rPr>
+        <w:t>PsychoPy</w:t>
+      </w:r>
+      <w:proofErr w:type="spellEnd"/>
+      <w:r>
+        <w:rPr>
+          <w:color w:val="000000"/>
+        </w:rPr>
+        <w:t xml:space="preserve"> puede procesarse en la aplicación web del curso, sin necesidad de instalar ningún software adicional:</w:t>
       </w:r>
     </w:p>
     <w:p>
@@ -2516,7 +3308,21 @@
           <w:color w:val="000000"/>
         </w:rPr>
         <w:tab/>
-        <w:t>Arrastrar el archivo .csv al área de carga.</w:t>
+        <w:t>Arrastrar el archivo .</w:t>
+      </w:r>
+      <w:proofErr w:type="spellStart"/>
+      <w:r>
+        <w:rPr>
+          <w:color w:val="000000"/>
+        </w:rPr>
+        <w:t>csv</w:t>
+      </w:r>
+      <w:proofErr w:type="spellEnd"/>
+      <w:r>
+        <w:rPr>
+          <w:color w:val="000000"/>
+        </w:rPr>
+        <w:t xml:space="preserve"> al área de carga.</w:t>
       </w:r>
     </w:p>
     <w:p>
@@ -2621,7 +3427,43 @@
                 <w:sz w:val="22"/>
                 <w:szCs w:val="22"/>
               </w:rPr>
-              <w:t>La aplicación procesa únicamente los trials de la fase experimental. Los trials de práctica no se incluyen en el análisis.</w:t>
+              <w:t xml:space="preserve">La aplicación procesa únicamente los </w:t>
+            </w:r>
+            <w:proofErr w:type="spellStart"/>
+            <w:r>
+              <w:rPr>
+                <w:color w:val="000000"/>
+                <w:sz w:val="22"/>
+                <w:szCs w:val="22"/>
+              </w:rPr>
+              <w:t>trials</w:t>
+            </w:r>
+            <w:proofErr w:type="spellEnd"/>
+            <w:r>
+              <w:rPr>
+                <w:color w:val="000000"/>
+                <w:sz w:val="22"/>
+                <w:szCs w:val="22"/>
+              </w:rPr>
+              <w:t xml:space="preserve"> de la fase experimental. Los </w:t>
+            </w:r>
+            <w:proofErr w:type="spellStart"/>
+            <w:r>
+              <w:rPr>
+                <w:color w:val="000000"/>
+                <w:sz w:val="22"/>
+                <w:szCs w:val="22"/>
+              </w:rPr>
+              <w:t>trials</w:t>
+            </w:r>
+            <w:proofErr w:type="spellEnd"/>
+            <w:r>
+              <w:rPr>
+                <w:color w:val="000000"/>
+                <w:sz w:val="22"/>
+                <w:szCs w:val="22"/>
+              </w:rPr>
+              <w:t xml:space="preserve"> de práctica no se incluyen en el análisis.</w:t>
             </w:r>
           </w:p>
         </w:tc>
@@ -2719,7 +3561,77 @@
         <w:rPr>
           <w:color w:val="000000"/>
         </w:rPr>
-        <w:t xml:space="preserve">Suni Lopez, F., Lopez Terrones, M. C., Henostroza Mesones, F., Guzman Martinez, J. M., Wissar Rodriguez, J. E., Pineda Palomino, D. A., &amp; Sánchez López, Á. (2024-2025). </w:t>
+        <w:t xml:space="preserve">Suni </w:t>
+      </w:r>
+      <w:proofErr w:type="spellStart"/>
+      <w:r>
+        <w:rPr>
+          <w:color w:val="000000"/>
+        </w:rPr>
+        <w:t>Lopez</w:t>
+      </w:r>
+      <w:proofErr w:type="spellEnd"/>
+      <w:r>
+        <w:rPr>
+          <w:color w:val="000000"/>
+        </w:rPr>
+        <w:t xml:space="preserve">, F., </w:t>
+      </w:r>
+      <w:proofErr w:type="spellStart"/>
+      <w:r>
+        <w:rPr>
+          <w:color w:val="000000"/>
+        </w:rPr>
+        <w:t>Lopez</w:t>
+      </w:r>
+      <w:proofErr w:type="spellEnd"/>
+      <w:r>
+        <w:rPr>
+          <w:color w:val="000000"/>
+        </w:rPr>
+        <w:t xml:space="preserve"> Terrones, M. C., Henostroza Mesones, F., Guzman </w:t>
+      </w:r>
+      <w:proofErr w:type="spellStart"/>
+      <w:r>
+        <w:rPr>
+          <w:color w:val="000000"/>
+        </w:rPr>
+        <w:t>Martinez</w:t>
+      </w:r>
+      <w:proofErr w:type="spellEnd"/>
+      <w:r>
+        <w:rPr>
+          <w:color w:val="000000"/>
+        </w:rPr>
+        <w:t xml:space="preserve">, J. M., </w:t>
+      </w:r>
+      <w:proofErr w:type="spellStart"/>
+      <w:r>
+        <w:rPr>
+          <w:color w:val="000000"/>
+        </w:rPr>
+        <w:t>Wissar</w:t>
+      </w:r>
+      <w:proofErr w:type="spellEnd"/>
+      <w:r>
+        <w:rPr>
+          <w:color w:val="000000"/>
+        </w:rPr>
+        <w:t xml:space="preserve"> </w:t>
+      </w:r>
+      <w:proofErr w:type="spellStart"/>
+      <w:r>
+        <w:rPr>
+          <w:color w:val="000000"/>
+        </w:rPr>
+        <w:t>Rodriguez</w:t>
+      </w:r>
+      <w:proofErr w:type="spellEnd"/>
+      <w:r>
+        <w:rPr>
+          <w:color w:val="000000"/>
+        </w:rPr>
+        <w:t xml:space="preserve">, J. E., Pineda Palomino, D. A., &amp; Sánchez López, Á. (2024-2025). </w:t>
       </w:r>
       <w:r>
         <w:rPr>
@@ -2727,7 +3639,79 @@
           <w:iCs/>
           <w:color w:val="000000"/>
         </w:rPr>
-        <w:t>Ulima Emotional Faces Dataset: un enfoque computacional para la creación de un dataset de expresiones emocionales en rostros latinos utilizando análisis biométrico y machine learning.</w:t>
+        <w:t xml:space="preserve">Ulima </w:t>
+      </w:r>
+      <w:proofErr w:type="spellStart"/>
+      <w:r>
+        <w:rPr>
+          <w:i/>
+          <w:iCs/>
+          <w:color w:val="000000"/>
+        </w:rPr>
+        <w:t>Emotional</w:t>
+      </w:r>
+      <w:proofErr w:type="spellEnd"/>
+      <w:r>
+        <w:rPr>
+          <w:i/>
+          <w:iCs/>
+          <w:color w:val="000000"/>
+        </w:rPr>
+        <w:t xml:space="preserve"> Faces </w:t>
+      </w:r>
+      <w:proofErr w:type="spellStart"/>
+      <w:r>
+        <w:rPr>
+          <w:i/>
+          <w:iCs/>
+          <w:color w:val="000000"/>
+        </w:rPr>
+        <w:t>Dataset</w:t>
+      </w:r>
+      <w:proofErr w:type="spellEnd"/>
+      <w:r>
+        <w:rPr>
+          <w:i/>
+          <w:iCs/>
+          <w:color w:val="000000"/>
+        </w:rPr>
+        <w:t xml:space="preserve">: un enfoque computacional para la creación de un </w:t>
+      </w:r>
+      <w:proofErr w:type="spellStart"/>
+      <w:r>
+        <w:rPr>
+          <w:i/>
+          <w:iCs/>
+          <w:color w:val="000000"/>
+        </w:rPr>
+        <w:t>dataset</w:t>
+      </w:r>
+      <w:proofErr w:type="spellEnd"/>
+      <w:r>
+        <w:rPr>
+          <w:i/>
+          <w:iCs/>
+          <w:color w:val="000000"/>
+        </w:rPr>
+        <w:t xml:space="preserve"> de expresiones emocionales en rostros latinos utilizando análisis biométrico y machine </w:t>
+      </w:r>
+      <w:proofErr w:type="spellStart"/>
+      <w:r>
+        <w:rPr>
+          <w:i/>
+          <w:iCs/>
+          <w:color w:val="000000"/>
+        </w:rPr>
+        <w:t>learning</w:t>
+      </w:r>
+      <w:proofErr w:type="spellEnd"/>
+      <w:r>
+        <w:rPr>
+          <w:i/>
+          <w:iCs/>
+          <w:color w:val="000000"/>
+        </w:rPr>
+        <w:t>.</w:t>
       </w:r>
       <w:r>
         <w:rPr>

</xml_diff>

<commit_message>
Add fixation-cross routines and trim stimuli set
Updates the PsychoPy experiment to include dedicated fixation-cross routines before both practice and experimental trials, and bumps the Builder version metadata. The dataset was reduced by removing emotion images 11–40 (keeping 10 per category), the autogenerated `categorizacion_emocional_lastrun.py` file was removed, and `.gitignore` now ignores `.DS_Store`. README and workshop docs were updated to match the new course cycle, repository structure, trial/media counts, and revised task flow.
</commit_message>
<xml_diff>
--- a/docs/guia_materiales_taller1.docx
+++ b/docs/guia_materiales_taller1.docx
@@ -1,6 +1,6 @@
 
 <file path=word/document.xml><?xml version="1.0" encoding="utf-8"?>
-<w:document xmlns:wpc="http://schemas.microsoft.com/office/word/2010/wordprocessingCanvas" xmlns:cx="http://schemas.microsoft.com/office/drawing/2014/chartex" xmlns:cx1="http://schemas.microsoft.com/office/drawing/2015/9/8/chartex" xmlns:cx2="http://schemas.microsoft.com/office/drawing/2015/10/21/chartex" xmlns:cx3="http://schemas.microsoft.com/office/drawing/2016/5/9/chartex" xmlns:cx4="http://schemas.microsoft.com/office/drawing/2016/5/10/chartex" xmlns:cx5="http://schemas.microsoft.com/office/drawing/2016/5/11/chartex" xmlns:cx6="http://schemas.microsoft.com/office/drawing/2016/5/12/chartex" xmlns:cx7="http://schemas.microsoft.com/office/drawing/2016/5/13/chartex" xmlns:cx8="http://schemas.microsoft.com/office/drawing/2016/5/14/chartex" xmlns:mc="http://schemas.openxmlformats.org/markup-compatibility/2006" xmlns:aink="http://schemas.microsoft.com/office/drawing/2016/ink" xmlns:am3d="http://schemas.microsoft.com/office/drawing/2017/model3d" xmlns:o="urn:schemas-microsoft-com:office:office" xmlns:oel="http://schemas.microsoft.com/office/2019/extlst" xmlns:r="http://schemas.openxmlformats.org/officeDocument/2006/relationships" xmlns:m="http://schemas.openxmlformats.org/officeDocument/2006/math" xmlns:v="urn:schemas-microsoft-com:vml" xmlns:wp14="http://schemas.microsoft.com/office/word/2010/wordprocessingDrawing" xmlns:wp="http://schemas.openxmlformats.org/drawingml/2006/wordprocessingDrawing" xmlns:w10="urn:schemas-microsoft-com:office:word" xmlns:w="http://schemas.openxmlformats.org/wordprocessingml/2006/main" xmlns:w14="http://schemas.microsoft.com/office/word/2010/wordml" xmlns:w15="http://schemas.microsoft.com/office/word/2012/wordml" xmlns:w16cex="http://schemas.microsoft.com/office/word/2018/wordml/cex" xmlns:w16cid="http://schemas.microsoft.com/office/word/2016/wordml/cid" xmlns:w16="http://schemas.microsoft.com/office/word/2018/wordml" xmlns:w16du="http://schemas.microsoft.com/office/word/2023/wordml/word16du" xmlns:w16sdtdh="http://schemas.microsoft.com/office/word/2020/wordml/sdtdatahash" xmlns:w16sdtfl="http://schemas.microsoft.com/office/word/2024/wordml/sdtformatlock" xmlns:w16se="http://schemas.microsoft.com/office/word/2015/wordml/symex" xmlns:wpg="http://schemas.microsoft.com/office/word/2010/wordprocessingGroup" xmlns:wpi="http://schemas.microsoft.com/office/word/2010/wordprocessingInk" xmlns:wne="http://schemas.microsoft.com/office/word/2006/wordml" xmlns:wps="http://schemas.microsoft.com/office/word/2010/wordprocessingShape" mc:Ignorable="w14 w15 w16se w16cid w16 w16cex w16sdtdh w16sdtfl w16du wp14">
+<w:document xmlns:wpc="http://schemas.microsoft.com/office/word/2010/wordprocessingCanvas" xmlns:cx="http://schemas.microsoft.com/office/drawing/2014/chartex" xmlns:cx1="http://schemas.microsoft.com/office/drawing/2015/9/8/chartex" xmlns:cx2="http://schemas.microsoft.com/office/drawing/2015/10/21/chartex" xmlns:cx3="http://schemas.microsoft.com/office/drawing/2016/5/9/chartex" xmlns:cx4="http://schemas.microsoft.com/office/drawing/2016/5/10/chartex" xmlns:cx5="http://schemas.microsoft.com/office/drawing/2016/5/11/chartex" xmlns:cx6="http://schemas.microsoft.com/office/drawing/2016/5/12/chartex" xmlns:cx7="http://schemas.microsoft.com/office/drawing/2016/5/13/chartex" xmlns:cx8="http://schemas.microsoft.com/office/drawing/2016/5/14/chartex" xmlns:mc="http://schemas.openxmlformats.org/markup-compatibility/2006" xmlns:m="http://schemas.openxmlformats.org/officeDocument/2006/math" xmlns:aink="http://schemas.microsoft.com/office/drawing/2016/ink" xmlns:am3d="http://schemas.microsoft.com/office/drawing/2017/model3d" xmlns:oel="http://schemas.microsoft.com/office/2019/extlst" xmlns:r="http://schemas.openxmlformats.org/officeDocument/2006/relationships" xmlns:wp14="http://schemas.microsoft.com/office/word/2010/wordprocessingDrawing" xmlns:wp="http://schemas.openxmlformats.org/drawingml/2006/wordprocessingDrawing" xmlns:wpg="http://schemas.microsoft.com/office/word/2010/wordprocessingGroup" xmlns:wpi="http://schemas.microsoft.com/office/word/2010/wordprocessingInk" xmlns:wps="http://schemas.microsoft.com/office/word/2010/wordprocessingShape" xmlns:o="urn:schemas-microsoft-com:office:office" xmlns:v="urn:schemas-microsoft-com:vml" xmlns:w10="urn:schemas-microsoft-com:office:word" xmlns:w="http://schemas.openxmlformats.org/wordprocessingml/2006/main" xmlns:w14="http://schemas.microsoft.com/office/word/2010/wordml" xmlns:w15="http://schemas.microsoft.com/office/word/2012/wordml" xmlns:w16cex="http://schemas.microsoft.com/office/word/2018/wordml/cex" xmlns:w16cid="http://schemas.microsoft.com/office/word/2016/wordml/cid" xmlns:w16="http://schemas.microsoft.com/office/word/2018/wordml" xmlns:w16sdtdh="http://schemas.microsoft.com/office/word/2020/wordml/sdtdatahash" xmlns:w16sdtfl="http://schemas.microsoft.com/office/word/2024/wordml/sdtformatlock" xmlns:w16se="http://schemas.microsoft.com/office/word/2015/wordml/symex" xmlns:w16du="http://schemas.microsoft.com/office/word/2023/wordml/word16du" xmlns:wne="http://schemas.microsoft.com/office/word/2006/wordml" mc:Ignorable="w14 w15 w16se w16cid w16 w16cex w16sdtdh w16sdtfl w16du wp14">
   <w:body>
     <w:p>
       <w:pPr>
@@ -56,7 +56,15 @@
           <w:sz w:val="22"/>
           <w:szCs w:val="22"/>
         </w:rPr>
-        <w:t xml:space="preserve"> | 2026-1</w:t>
+        <w:t xml:space="preserve"> | 2026-</w:t>
+      </w:r>
+      <w:r>
+        <w:rPr>
+          <w:color w:val="000000"/>
+          <w:sz w:val="22"/>
+          <w:szCs w:val="22"/>
+        </w:rPr>
+        <w:t>2</w:t>
       </w:r>
     </w:p>
     <w:p>
@@ -82,273 +90,12 @@
         <w:rPr>
           <w:color w:val="000000"/>
         </w:rPr>
-        <w:t xml:space="preserve">Este documento describe los materiales del Taller 1 del curso, centrado en el diseño e implementación de una tarea de categorización de expresiones emocionales en </w:t>
-      </w:r>
-      <w:proofErr w:type="spellStart"/>
-      <w:r>
-        <w:rPr>
-          <w:color w:val="000000"/>
-        </w:rPr>
-        <w:t>PsychoPy</w:t>
-      </w:r>
-      <w:proofErr w:type="spellEnd"/>
-      <w:r>
-        <w:rPr>
-          <w:color w:val="000000"/>
-        </w:rPr>
-        <w:t xml:space="preserve"> </w:t>
-      </w:r>
-      <w:proofErr w:type="spellStart"/>
-      <w:r>
-        <w:rPr>
-          <w:color w:val="000000"/>
-        </w:rPr>
-        <w:t>Builder</w:t>
-      </w:r>
-      <w:proofErr w:type="spellEnd"/>
-      <w:r>
-        <w:rPr>
-          <w:color w:val="000000"/>
-        </w:rPr>
-        <w:t>. La tarea es una adaptación del Experimento 1 de Calvo &amp; Lundqvist (2008), en condiciones de visualización libre (free-</w:t>
-      </w:r>
-      <w:proofErr w:type="spellStart"/>
-      <w:r>
-        <w:rPr>
-          <w:color w:val="000000"/>
-        </w:rPr>
-        <w:t>viewing</w:t>
-      </w:r>
-      <w:proofErr w:type="spellEnd"/>
-      <w:r>
-        <w:rPr>
-          <w:color w:val="000000"/>
-        </w:rPr>
-        <w:t xml:space="preserve">), utilizando el Ulima </w:t>
-      </w:r>
-      <w:proofErr w:type="spellStart"/>
-      <w:r>
-        <w:rPr>
-          <w:color w:val="000000"/>
-        </w:rPr>
-        <w:t>Emotional</w:t>
-      </w:r>
-      <w:proofErr w:type="spellEnd"/>
-      <w:r>
-        <w:rPr>
-          <w:color w:val="000000"/>
-        </w:rPr>
-        <w:t xml:space="preserve"> Faces </w:t>
-      </w:r>
-      <w:proofErr w:type="spellStart"/>
-      <w:r>
-        <w:rPr>
-          <w:color w:val="000000"/>
-        </w:rPr>
-        <w:t>Dataset</w:t>
-      </w:r>
-      <w:proofErr w:type="spellEnd"/>
-      <w:r>
-        <w:rPr>
-          <w:color w:val="000000"/>
-        </w:rPr>
-        <w:t xml:space="preserve"> como fuente de estímulos.</w:t>
-      </w:r>
-    </w:p>
-    <w:p>
-      <w:pPr>
-        <w:spacing w:before="360" w:after="120" w:line="276" w:lineRule="auto"/>
-        <w:jc w:val="both"/>
-      </w:pPr>
-      <w:r>
-        <w:rPr>
-          <w:b/>
-          <w:bCs/>
-          <w:color w:val="000000"/>
-        </w:rPr>
-        <w:t>2. Cómo descargar los materiales</w:t>
-      </w:r>
-    </w:p>
-    <w:p>
-      <w:pPr>
-        <w:spacing w:after="120" w:line="276" w:lineRule="auto"/>
-        <w:jc w:val="both"/>
-      </w:pPr>
-      <w:r>
-        <w:rPr>
-          <w:color w:val="000000"/>
-        </w:rPr>
-        <w:t>Seguir los siguientes pasos para obtener todos los archivos necesarios antes del taller:</w:t>
-      </w:r>
-    </w:p>
-    <w:p>
-      <w:pPr>
-        <w:spacing w:before="40" w:after="40" w:line="276" w:lineRule="auto"/>
-        <w:ind w:left="720" w:hanging="360"/>
-        <w:jc w:val="both"/>
-      </w:pPr>
-      <w:r>
-        <w:rPr>
-          <w:color w:val="000000"/>
-        </w:rPr>
-        <w:t>1.</w:t>
-      </w:r>
-      <w:r>
-        <w:rPr>
-          <w:color w:val="000000"/>
-        </w:rPr>
-        <w:tab/>
-        <w:t>Ingresar al repositorio del taller en GitHub.</w:t>
-      </w:r>
-    </w:p>
-    <w:p>
-      <w:pPr>
-        <w:spacing w:before="40" w:after="40" w:line="276" w:lineRule="auto"/>
-        <w:ind w:left="720" w:hanging="360"/>
-        <w:jc w:val="both"/>
-      </w:pPr>
-      <w:r>
-        <w:rPr>
-          <w:color w:val="000000"/>
-        </w:rPr>
-        <w:t>2.</w:t>
-      </w:r>
-      <w:r>
-        <w:rPr>
-          <w:color w:val="000000"/>
-        </w:rPr>
-        <w:tab/>
-        <w:t>Hacer clic en el botón verde Code en la parte superior de la página.</w:t>
-      </w:r>
-    </w:p>
-    <w:p>
-      <w:pPr>
-        <w:spacing w:before="40" w:after="40" w:line="276" w:lineRule="auto"/>
-        <w:ind w:left="720" w:hanging="360"/>
-        <w:jc w:val="both"/>
-      </w:pPr>
-      <w:r>
-        <w:rPr>
-          <w:color w:val="000000"/>
-        </w:rPr>
-        <w:t>3.</w:t>
-      </w:r>
-      <w:r>
-        <w:rPr>
-          <w:color w:val="000000"/>
-        </w:rPr>
-        <w:tab/>
-        <w:t xml:space="preserve">Seleccionar </w:t>
-      </w:r>
-      <w:proofErr w:type="spellStart"/>
-      <w:r>
-        <w:rPr>
-          <w:color w:val="000000"/>
-        </w:rPr>
-        <w:t>Download</w:t>
-      </w:r>
-      <w:proofErr w:type="spellEnd"/>
-      <w:r>
-        <w:rPr>
-          <w:color w:val="000000"/>
-        </w:rPr>
-        <w:t xml:space="preserve"> ZIP.</w:t>
-      </w:r>
-    </w:p>
-    <w:p>
-      <w:pPr>
-        <w:spacing w:before="40" w:after="40" w:line="276" w:lineRule="auto"/>
-        <w:ind w:left="720" w:hanging="360"/>
-        <w:jc w:val="both"/>
-      </w:pPr>
-      <w:r>
-        <w:rPr>
-          <w:color w:val="000000"/>
-        </w:rPr>
-        <w:t>4.</w:t>
-      </w:r>
-      <w:r>
-        <w:rPr>
-          <w:color w:val="000000"/>
-        </w:rPr>
-        <w:tab/>
-        <w:t>Descomprimir el archivo en la computadora.</w:t>
-      </w:r>
-    </w:p>
-    <w:p>
-      <w:pPr>
-        <w:spacing w:before="40" w:after="40" w:line="276" w:lineRule="auto"/>
-        <w:ind w:left="720" w:hanging="360"/>
-        <w:jc w:val="both"/>
-      </w:pPr>
-      <w:r>
-        <w:rPr>
-          <w:color w:val="000000"/>
-        </w:rPr>
-        <w:t>5.</w:t>
-      </w:r>
-      <w:r>
-        <w:rPr>
-          <w:color w:val="000000"/>
-        </w:rPr>
-        <w:tab/>
-        <w:t xml:space="preserve">Abrir </w:t>
-      </w:r>
-      <w:proofErr w:type="spellStart"/>
-      <w:r>
-        <w:rPr>
-          <w:color w:val="000000"/>
-        </w:rPr>
-        <w:t>PsychoPy</w:t>
-      </w:r>
-      <w:proofErr w:type="spellEnd"/>
-      <w:r>
-        <w:rPr>
-          <w:color w:val="000000"/>
-        </w:rPr>
-        <w:t xml:space="preserve"> </w:t>
-      </w:r>
-      <w:proofErr w:type="spellStart"/>
-      <w:r>
-        <w:rPr>
-          <w:color w:val="000000"/>
-        </w:rPr>
-        <w:t>Builder</w:t>
-      </w:r>
-      <w:proofErr w:type="spellEnd"/>
-      <w:r>
-        <w:rPr>
-          <w:color w:val="000000"/>
-        </w:rPr>
-        <w:t xml:space="preserve"> y cargar el archivo </w:t>
-      </w:r>
-      <w:proofErr w:type="spellStart"/>
-      <w:r>
-        <w:rPr>
-          <w:color w:val="000000"/>
-        </w:rPr>
-        <w:t>categorizacion_</w:t>
-      </w:r>
-      <w:proofErr w:type="gramStart"/>
-      <w:r>
-        <w:rPr>
-          <w:color w:val="000000"/>
-        </w:rPr>
-        <w:t>emocional.psyexp</w:t>
-      </w:r>
-      <w:proofErr w:type="spellEnd"/>
-      <w:proofErr w:type="gramEnd"/>
-      <w:r>
-        <w:rPr>
-          <w:color w:val="000000"/>
-        </w:rPr>
-        <w:t>.</w:t>
+        <w:t>Este documento describe los materiales del Taller 1 del curso, centrado en el diseño e implementación de una tarea de categorización de expresiones emocionales en PsychoPy Builder. La tarea es una adaptación del Experimento 1 de Calvo &amp; Lundqvist (2008), en condiciones de visualización libre (free-viewing), utilizando el Ulima Emotional Faces Dataset como fuente de estímulos.</w:t>
       </w:r>
     </w:p>
     <w:p>
       <w:pPr>
         <w:spacing w:before="80"/>
-        <w:jc w:val="both"/>
       </w:pPr>
     </w:p>
     <w:tbl>
@@ -410,25 +157,23 @@
                 <w:sz w:val="22"/>
                 <w:szCs w:val="22"/>
               </w:rPr>
-              <w:t xml:space="preserve">No mover ni renombrar ninguna carpeta. </w:t>
-            </w:r>
-            <w:proofErr w:type="spellStart"/>
+              <w:t xml:space="preserve">El archivo .psyexp será completado durante el taller. Al finalizar </w:t>
+            </w:r>
             <w:r>
               <w:rPr>
                 <w:color w:val="000000"/>
                 <w:sz w:val="22"/>
                 <w:szCs w:val="22"/>
               </w:rPr>
-              <w:t>PsychoPy</w:t>
-            </w:r>
-            <w:proofErr w:type="spellEnd"/>
+              <w:t>el taller</w:t>
+            </w:r>
             <w:r>
               <w:rPr>
                 <w:color w:val="000000"/>
                 <w:sz w:val="22"/>
                 <w:szCs w:val="22"/>
               </w:rPr>
-              <w:t xml:space="preserve"> necesita encontrar los archivos exactamente en las rutas que se configurarán durante el taller.</w:t>
+              <w:t xml:space="preserve"> se subirá la versión resuelta al repositorio.</w:t>
             </w:r>
           </w:p>
         </w:tc>
@@ -445,7 +190,7 @@
           <w:bCs/>
           <w:color w:val="000000"/>
         </w:rPr>
-        <w:t>3. Estructura del repositorio</w:t>
+        <w:t>2. Cómo descargar los materiales</w:t>
       </w:r>
     </w:p>
     <w:p>
@@ -457,8 +202,114 @@
         <w:rPr>
           <w:color w:val="000000"/>
         </w:rPr>
-        <w:t>Una vez descomprimido el archivo ZIP, la estructura de carpetas debe ser la siguiente:</w:t>
-      </w:r>
+        <w:t>Seguir los siguientes pasos para obtener todos los archivos necesarios antes del taller:</w:t>
+      </w:r>
+    </w:p>
+    <w:p>
+      <w:pPr>
+        <w:spacing w:before="40" w:after="40" w:line="276" w:lineRule="auto"/>
+        <w:ind w:left="720" w:hanging="360"/>
+        <w:jc w:val="both"/>
+      </w:pPr>
+      <w:r>
+        <w:rPr>
+          <w:color w:val="000000"/>
+        </w:rPr>
+        <w:t>1.</w:t>
+      </w:r>
+      <w:r>
+        <w:rPr>
+          <w:color w:val="000000"/>
+        </w:rPr>
+        <w:tab/>
+        <w:t>Ingresar al repositorio del taller en GitHub.</w:t>
+      </w:r>
+    </w:p>
+    <w:p>
+      <w:pPr>
+        <w:spacing w:before="40" w:after="40" w:line="276" w:lineRule="auto"/>
+        <w:ind w:left="720" w:hanging="360"/>
+        <w:jc w:val="both"/>
+      </w:pPr>
+      <w:r>
+        <w:rPr>
+          <w:color w:val="000000"/>
+        </w:rPr>
+        <w:t>2.</w:t>
+      </w:r>
+      <w:r>
+        <w:rPr>
+          <w:color w:val="000000"/>
+        </w:rPr>
+        <w:tab/>
+        <w:t>Hacer clic en el botón verde Code en la parte superior de la página.</w:t>
+      </w:r>
+    </w:p>
+    <w:p>
+      <w:pPr>
+        <w:spacing w:before="40" w:after="40" w:line="276" w:lineRule="auto"/>
+        <w:ind w:left="720" w:hanging="360"/>
+        <w:jc w:val="both"/>
+      </w:pPr>
+      <w:r>
+        <w:rPr>
+          <w:color w:val="000000"/>
+        </w:rPr>
+        <w:t>3.</w:t>
+      </w:r>
+      <w:r>
+        <w:rPr>
+          <w:color w:val="000000"/>
+        </w:rPr>
+        <w:tab/>
+        <w:t>Seleccionar Download ZIP.</w:t>
+      </w:r>
+    </w:p>
+    <w:p>
+      <w:pPr>
+        <w:spacing w:before="40" w:after="40" w:line="276" w:lineRule="auto"/>
+        <w:ind w:left="720" w:hanging="360"/>
+        <w:jc w:val="both"/>
+      </w:pPr>
+      <w:r>
+        <w:rPr>
+          <w:color w:val="000000"/>
+        </w:rPr>
+        <w:t>4.</w:t>
+      </w:r>
+      <w:r>
+        <w:rPr>
+          <w:color w:val="000000"/>
+        </w:rPr>
+        <w:tab/>
+        <w:t>Descomprimir el archivo en la computadora.</w:t>
+      </w:r>
+    </w:p>
+    <w:p>
+      <w:pPr>
+        <w:spacing w:before="40" w:after="40" w:line="276" w:lineRule="auto"/>
+        <w:ind w:left="720" w:hanging="360"/>
+        <w:jc w:val="both"/>
+      </w:pPr>
+      <w:r>
+        <w:rPr>
+          <w:color w:val="000000"/>
+        </w:rPr>
+        <w:t>5.</w:t>
+      </w:r>
+      <w:r>
+        <w:rPr>
+          <w:color w:val="000000"/>
+        </w:rPr>
+        <w:tab/>
+        <w:t>Abrir PsychoPy Builder y cargar el archivo categorizacion_emocional.psyexp.</w:t>
+      </w:r>
+    </w:p>
+    <w:p>
+      <w:pPr>
+        <w:spacing w:before="80"/>
+        <w:jc w:val="both"/>
+      </w:pPr>
     </w:p>
     <w:tbl>
       <w:tblPr>
@@ -490,6 +341,97 @@
               <w:bottom w:val="single" w:sz="4" w:space="0" w:color="AAAAAA"/>
               <w:right w:val="single" w:sz="4" w:space="0" w:color="AAAAAA"/>
             </w:tcBorders>
+            <w:shd w:val="clear" w:color="auto" w:fill="FFFFFF"/>
+            <w:tcMar>
+              <w:top w:w="120" w:type="dxa"/>
+              <w:left w:w="240" w:type="dxa"/>
+              <w:bottom w:w="120" w:type="dxa"/>
+              <w:right w:w="240" w:type="dxa"/>
+            </w:tcMar>
+          </w:tcPr>
+          <w:p>
+            <w:pPr>
+              <w:spacing w:line="276" w:lineRule="auto"/>
+              <w:jc w:val="both"/>
+            </w:pPr>
+            <w:r>
+              <w:rPr>
+                <w:b/>
+                <w:bCs/>
+                <w:color w:val="000000"/>
+                <w:sz w:val="22"/>
+                <w:szCs w:val="22"/>
+              </w:rPr>
+              <w:t xml:space="preserve">Nota. </w:t>
+            </w:r>
+            <w:r>
+              <w:rPr>
+                <w:color w:val="000000"/>
+                <w:sz w:val="22"/>
+                <w:szCs w:val="22"/>
+              </w:rPr>
+              <w:t>No mover ni renombrar ninguna carpeta. PsychoPy necesita encontrar los archivos exactamente en las rutas que se configurarán durante el taller.</w:t>
+            </w:r>
+          </w:p>
+        </w:tc>
+      </w:tr>
+    </w:tbl>
+    <w:p>
+      <w:pPr>
+        <w:spacing w:before="360" w:after="120" w:line="276" w:lineRule="auto"/>
+        <w:jc w:val="both"/>
+      </w:pPr>
+      <w:r>
+        <w:rPr>
+          <w:b/>
+          <w:bCs/>
+          <w:color w:val="000000"/>
+        </w:rPr>
+        <w:t>3. Estructura del repositorio</w:t>
+      </w:r>
+    </w:p>
+    <w:p>
+      <w:pPr>
+        <w:spacing w:after="120" w:line="276" w:lineRule="auto"/>
+        <w:jc w:val="both"/>
+      </w:pPr>
+      <w:r>
+        <w:rPr>
+          <w:color w:val="000000"/>
+        </w:rPr>
+        <w:t>Una vez descomprimido el archivo ZIP, la estructura de carpetas debe ser la siguiente:</w:t>
+      </w:r>
+    </w:p>
+    <w:tbl>
+      <w:tblPr>
+        <w:tblW w:w="9026" w:type="dxa"/>
+        <w:tblBorders>
+          <w:top w:val="single" w:sz="4" w:space="0" w:color="auto"/>
+          <w:left w:val="single" w:sz="4" w:space="0" w:color="auto"/>
+          <w:bottom w:val="single" w:sz="4" w:space="0" w:color="auto"/>
+          <w:right w:val="single" w:sz="4" w:space="0" w:color="auto"/>
+          <w:insideH w:val="single" w:sz="4" w:space="0" w:color="auto"/>
+          <w:insideV w:val="single" w:sz="4" w:space="0" w:color="auto"/>
+        </w:tblBorders>
+        <w:tblCellMar>
+          <w:left w:w="10" w:type="dxa"/>
+          <w:right w:w="10" w:type="dxa"/>
+        </w:tblCellMar>
+        <w:tblLook w:val="0000" w:firstRow="0" w:lastRow="0" w:firstColumn="0" w:lastColumn="0" w:noHBand="0" w:noVBand="0"/>
+      </w:tblPr>
+      <w:tblGrid>
+        <w:gridCol w:w="9026"/>
+      </w:tblGrid>
+      <w:tr>
+        <w:tc>
+          <w:tcPr>
+            <w:tcW w:w="9026" w:type="dxa"/>
+            <w:tcBorders>
+              <w:top w:val="single" w:sz="4" w:space="0" w:color="AAAAAA"/>
+              <w:left w:val="single" w:sz="4" w:space="0" w:color="AAAAAA"/>
+              <w:bottom w:val="single" w:sz="4" w:space="0" w:color="AAAAAA"/>
+              <w:right w:val="single" w:sz="4" w:space="0" w:color="AAAAAA"/>
+            </w:tcBorders>
             <w:shd w:val="clear" w:color="auto" w:fill="F5F5F5"/>
             <w:tcMar>
               <w:top w:w="140" w:type="dxa"/>
@@ -537,9 +479,13 @@
                 <w:sz w:val="20"/>
                 <w:szCs w:val="20"/>
               </w:rPr>
-              <w:t xml:space="preserve">├── </w:t>
-            </w:r>
-            <w:proofErr w:type="spellStart"/>
+              <w:t>├── categorizacion_emocional.psyexp</w:t>
+            </w:r>
+          </w:p>
+          <w:p>
+            <w:pPr>
+              <w:spacing w:before="20" w:after="20"/>
+            </w:pPr>
             <w:r>
               <w:rPr>
                 <w:rFonts w:ascii="Courier New" w:eastAsia="Courier New" w:hAnsi="Courier New" w:cs="Courier New"/>
@@ -547,9 +493,13 @@
                 <w:sz w:val="20"/>
                 <w:szCs w:val="20"/>
               </w:rPr>
-              <w:t>categorizacion_</w:t>
-            </w:r>
-            <w:proofErr w:type="gramStart"/>
+              <w:t>│</w:t>
+            </w:r>
+          </w:p>
+          <w:p>
+            <w:pPr>
+              <w:spacing w:before="20" w:after="20"/>
+            </w:pPr>
             <w:r>
               <w:rPr>
                 <w:rFonts w:ascii="Courier New" w:eastAsia="Courier New" w:hAnsi="Courier New" w:cs="Courier New"/>
@@ -557,10 +507,8 @@
                 <w:sz w:val="20"/>
                 <w:szCs w:val="20"/>
               </w:rPr>
-              <w:t>emocional.psyexp</w:t>
-            </w:r>
-            <w:proofErr w:type="spellEnd"/>
-            <w:proofErr w:type="gramEnd"/>
+              <w:t>├── conditions/</w:t>
+            </w:r>
           </w:p>
           <w:p>
             <w:pPr>
@@ -573,13 +521,8 @@
                 <w:sz w:val="20"/>
                 <w:szCs w:val="20"/>
               </w:rPr>
-              <w:t>│</w:t>
-            </w:r>
-          </w:p>
-          <w:p>
-            <w:pPr>
-              <w:spacing w:before="20" w:after="20"/>
-            </w:pPr>
+              <w:t xml:space="preserve">│   ├── condiciones_experimental.xlsx   (40 trials </w:t>
+            </w:r>
             <w:r>
               <w:rPr>
                 <w:rFonts w:ascii="Courier New" w:eastAsia="Courier New" w:hAnsi="Courier New" w:cs="Courier New"/>
@@ -587,9 +530,8 @@
                 <w:sz w:val="20"/>
                 <w:szCs w:val="20"/>
               </w:rPr>
-              <w:t xml:space="preserve">├── </w:t>
-            </w:r>
-            <w:proofErr w:type="spellStart"/>
+              <w:t>-</w:t>
+            </w:r>
             <w:r>
               <w:rPr>
                 <w:rFonts w:ascii="Courier New" w:eastAsia="Courier New" w:hAnsi="Courier New" w:cs="Courier New"/>
@@ -597,9 +539,13 @@
                 <w:sz w:val="20"/>
                 <w:szCs w:val="20"/>
               </w:rPr>
-              <w:t>conditions</w:t>
-            </w:r>
-            <w:proofErr w:type="spellEnd"/>
+              <w:t xml:space="preserve"> fase experimental)</w:t>
+            </w:r>
+          </w:p>
+          <w:p>
+            <w:pPr>
+              <w:spacing w:before="20" w:after="20"/>
+            </w:pPr>
             <w:r>
               <w:rPr>
                 <w:rFonts w:ascii="Courier New" w:eastAsia="Courier New" w:hAnsi="Courier New" w:cs="Courier New"/>
@@ -607,13 +553,8 @@
                 <w:sz w:val="20"/>
                 <w:szCs w:val="20"/>
               </w:rPr>
-              <w:t>/</w:t>
-            </w:r>
-          </w:p>
-          <w:p>
-            <w:pPr>
-              <w:spacing w:before="20" w:after="20"/>
-            </w:pPr>
+              <w:t xml:space="preserve">│   └── condiciones_practica.xlsx        (12 trials </w:t>
+            </w:r>
             <w:r>
               <w:rPr>
                 <w:rFonts w:ascii="Courier New" w:eastAsia="Courier New" w:hAnsi="Courier New" w:cs="Courier New"/>
@@ -621,9 +562,8 @@
                 <w:sz w:val="20"/>
                 <w:szCs w:val="20"/>
               </w:rPr>
-              <w:t>│   ├── condiciones_experimental.xlsx</w:t>
-            </w:r>
-            <w:proofErr w:type="gramStart"/>
+              <w:t>-</w:t>
+            </w:r>
             <w:r>
               <w:rPr>
                 <w:rFonts w:ascii="Courier New" w:eastAsia="Courier New" w:hAnsi="Courier New" w:cs="Courier New"/>
@@ -631,19 +571,19 @@
                 <w:sz w:val="20"/>
                 <w:szCs w:val="20"/>
               </w:rPr>
-              <w:t xml:space="preserve">   (</w:t>
-            </w:r>
-            <w:proofErr w:type="gramEnd"/>
-            <w:r>
+              <w:t xml:space="preserve"> fase de práctica)</w:t>
+            </w:r>
+          </w:p>
+          <w:p>
+            <w:pPr>
+              <w:spacing w:before="20" w:after="20"/>
               <w:rPr>
                 <w:rFonts w:ascii="Courier New" w:eastAsia="Courier New" w:hAnsi="Courier New" w:cs="Courier New"/>
                 <w:color w:val="000000"/>
                 <w:sz w:val="20"/>
                 <w:szCs w:val="20"/>
               </w:rPr>
-              <w:t xml:space="preserve">40 </w:t>
-            </w:r>
-            <w:proofErr w:type="spellStart"/>
+            </w:pPr>
             <w:r>
               <w:rPr>
                 <w:rFonts w:ascii="Courier New" w:eastAsia="Courier New" w:hAnsi="Courier New" w:cs="Courier New"/>
@@ -651,9 +591,13 @@
                 <w:sz w:val="20"/>
                 <w:szCs w:val="20"/>
               </w:rPr>
-              <w:t>trials</w:t>
-            </w:r>
-            <w:proofErr w:type="spellEnd"/>
+              <w:t>│</w:t>
+            </w:r>
+          </w:p>
+          <w:p>
+            <w:pPr>
+              <w:spacing w:before="20" w:after="20"/>
+            </w:pPr>
             <w:r>
               <w:rPr>
                 <w:rFonts w:ascii="Courier New" w:eastAsia="Courier New" w:hAnsi="Courier New" w:cs="Courier New"/>
@@ -661,151 +605,7 @@
                 <w:sz w:val="20"/>
                 <w:szCs w:val="20"/>
               </w:rPr>
-              <w:t xml:space="preserve"> </w:t>
-            </w:r>
-            <w:r>
-              <w:rPr>
-                <w:rFonts w:ascii="Courier New" w:eastAsia="Courier New" w:hAnsi="Courier New" w:cs="Courier New"/>
-                <w:color w:val="000000"/>
-                <w:sz w:val="20"/>
-                <w:szCs w:val="20"/>
-              </w:rPr>
-              <w:t>-</w:t>
-            </w:r>
-            <w:r>
-              <w:rPr>
-                <w:rFonts w:ascii="Courier New" w:eastAsia="Courier New" w:hAnsi="Courier New" w:cs="Courier New"/>
-                <w:color w:val="000000"/>
-                <w:sz w:val="20"/>
-                <w:szCs w:val="20"/>
-              </w:rPr>
-              <w:t xml:space="preserve"> fase experimental)</w:t>
-            </w:r>
-          </w:p>
-          <w:p>
-            <w:pPr>
-              <w:spacing w:before="20" w:after="20"/>
-            </w:pPr>
-            <w:r>
-              <w:rPr>
-                <w:rFonts w:ascii="Courier New" w:eastAsia="Courier New" w:hAnsi="Courier New" w:cs="Courier New"/>
-                <w:color w:val="000000"/>
-                <w:sz w:val="20"/>
-                <w:szCs w:val="20"/>
-              </w:rPr>
-              <w:t xml:space="preserve">│   └── condiciones_practica.xlsx     </w:t>
-            </w:r>
-            <w:proofErr w:type="gramStart"/>
-            <w:r>
-              <w:rPr>
-                <w:rFonts w:ascii="Courier New" w:eastAsia="Courier New" w:hAnsi="Courier New" w:cs="Courier New"/>
-                <w:color w:val="000000"/>
-                <w:sz w:val="20"/>
-                <w:szCs w:val="20"/>
-              </w:rPr>
-              <w:t xml:space="preserve">   (</w:t>
-            </w:r>
-            <w:proofErr w:type="gramEnd"/>
-            <w:r>
-              <w:rPr>
-                <w:rFonts w:ascii="Courier New" w:eastAsia="Courier New" w:hAnsi="Courier New" w:cs="Courier New"/>
-                <w:color w:val="000000"/>
-                <w:sz w:val="20"/>
-                <w:szCs w:val="20"/>
-              </w:rPr>
-              <w:t xml:space="preserve">12 </w:t>
-            </w:r>
-            <w:proofErr w:type="spellStart"/>
-            <w:r>
-              <w:rPr>
-                <w:rFonts w:ascii="Courier New" w:eastAsia="Courier New" w:hAnsi="Courier New" w:cs="Courier New"/>
-                <w:color w:val="000000"/>
-                <w:sz w:val="20"/>
-                <w:szCs w:val="20"/>
-              </w:rPr>
-              <w:t>trials</w:t>
-            </w:r>
-            <w:proofErr w:type="spellEnd"/>
-            <w:r>
-              <w:rPr>
-                <w:rFonts w:ascii="Courier New" w:eastAsia="Courier New" w:hAnsi="Courier New" w:cs="Courier New"/>
-                <w:color w:val="000000"/>
-                <w:sz w:val="20"/>
-                <w:szCs w:val="20"/>
-              </w:rPr>
-              <w:t xml:space="preserve"> </w:t>
-            </w:r>
-            <w:r>
-              <w:rPr>
-                <w:rFonts w:ascii="Courier New" w:eastAsia="Courier New" w:hAnsi="Courier New" w:cs="Courier New"/>
-                <w:color w:val="000000"/>
-                <w:sz w:val="20"/>
-                <w:szCs w:val="20"/>
-              </w:rPr>
-              <w:t>-</w:t>
-            </w:r>
-            <w:r>
-              <w:rPr>
-                <w:rFonts w:ascii="Courier New" w:eastAsia="Courier New" w:hAnsi="Courier New" w:cs="Courier New"/>
-                <w:color w:val="000000"/>
-                <w:sz w:val="20"/>
-                <w:szCs w:val="20"/>
-              </w:rPr>
-              <w:t xml:space="preserve"> fase de práctica)</w:t>
-            </w:r>
-          </w:p>
-          <w:p>
-            <w:pPr>
-              <w:spacing w:before="20" w:after="20"/>
-              <w:rPr>
-                <w:rFonts w:ascii="Courier New" w:eastAsia="Courier New" w:hAnsi="Courier New" w:cs="Courier New"/>
-                <w:color w:val="000000"/>
-                <w:sz w:val="20"/>
-                <w:szCs w:val="20"/>
-              </w:rPr>
-            </w:pPr>
-            <w:r>
-              <w:rPr>
-                <w:rFonts w:ascii="Courier New" w:eastAsia="Courier New" w:hAnsi="Courier New" w:cs="Courier New"/>
-                <w:color w:val="000000"/>
-                <w:sz w:val="20"/>
-                <w:szCs w:val="20"/>
-              </w:rPr>
-              <w:t>│</w:t>
-            </w:r>
-          </w:p>
-          <w:p>
-            <w:pPr>
-              <w:spacing w:before="20" w:after="20"/>
-            </w:pPr>
-            <w:r>
-              <w:rPr>
-                <w:rFonts w:ascii="Courier New" w:eastAsia="Courier New" w:hAnsi="Courier New" w:cs="Courier New"/>
-                <w:color w:val="000000"/>
-                <w:sz w:val="20"/>
-                <w:szCs w:val="20"/>
-              </w:rPr>
-              <w:t xml:space="preserve">├── </w:t>
-            </w:r>
-            <w:proofErr w:type="spellStart"/>
-            <w:r>
-              <w:rPr>
-                <w:rFonts w:ascii="Courier New" w:eastAsia="Courier New" w:hAnsi="Courier New" w:cs="Courier New"/>
-                <w:color w:val="000000"/>
-                <w:sz w:val="20"/>
-                <w:szCs w:val="20"/>
-              </w:rPr>
-              <w:t>docs</w:t>
-            </w:r>
-            <w:proofErr w:type="spellEnd"/>
-            <w:r>
-              <w:rPr>
-                <w:rFonts w:ascii="Courier New" w:eastAsia="Courier New" w:hAnsi="Courier New" w:cs="Courier New"/>
-                <w:color w:val="000000"/>
-                <w:sz w:val="20"/>
-                <w:szCs w:val="20"/>
-              </w:rPr>
-              <w:t>/</w:t>
+              <w:t>├── docs/</w:t>
             </w:r>
           </w:p>
           <w:p>
@@ -874,6 +674,7 @@
                 <w:szCs w:val="20"/>
                 <w:lang w:val="en-US"/>
               </w:rPr>
+              <w:lastRenderedPageBreak/>
               <w:t>├── media/</w:t>
             </w:r>
           </w:p>
@@ -914,16 +715,8 @@
                 <w:szCs w:val="20"/>
                 <w:lang w:val="en-US"/>
               </w:rPr>
-              <w:t>anger_01.png … anger_40.png)</w:t>
-            </w:r>
-          </w:p>
-          <w:p>
-            <w:pPr>
-              <w:spacing w:before="20" w:after="20"/>
-              <w:rPr>
-                <w:lang w:val="en-US"/>
-              </w:rPr>
-            </w:pPr>
+              <w:t>anger_01.png … anger_</w:t>
+            </w:r>
             <w:r>
               <w:rPr>
                 <w:rFonts w:ascii="Courier New" w:eastAsia="Courier New" w:hAnsi="Courier New" w:cs="Courier New"/>
@@ -932,9 +725,8 @@
                 <w:szCs w:val="20"/>
                 <w:lang w:val="en-US"/>
               </w:rPr>
-              <w:t xml:space="preserve">│   ├── fear/     </w:t>
-            </w:r>
-            <w:proofErr w:type="gramStart"/>
+              <w:t>1</w:t>
+            </w:r>
             <w:r>
               <w:rPr>
                 <w:rFonts w:ascii="Courier New" w:eastAsia="Courier New" w:hAnsi="Courier New" w:cs="Courier New"/>
@@ -943,9 +735,16 @@
                 <w:szCs w:val="20"/>
                 <w:lang w:val="en-US"/>
               </w:rPr>
-              <w:t xml:space="preserve">   (</w:t>
-            </w:r>
-            <w:proofErr w:type="gramEnd"/>
+              <w:t>0.png)</w:t>
+            </w:r>
+          </w:p>
+          <w:p>
+            <w:pPr>
+              <w:spacing w:before="20" w:after="20"/>
+              <w:rPr>
+                <w:lang w:val="en-US"/>
+              </w:rPr>
+            </w:pPr>
             <w:r>
               <w:rPr>
                 <w:rFonts w:ascii="Courier New" w:eastAsia="Courier New" w:hAnsi="Courier New" w:cs="Courier New"/>
@@ -954,16 +753,9 @@
                 <w:szCs w:val="20"/>
                 <w:lang w:val="en-US"/>
               </w:rPr>
-              <w:t>fear_01.png … fear_40.png)</w:t>
-            </w:r>
-          </w:p>
-          <w:p>
-            <w:pPr>
-              <w:spacing w:before="20" w:after="20"/>
-              <w:rPr>
-                <w:lang w:val="en-US"/>
-              </w:rPr>
-            </w:pPr>
+              <w:t xml:space="preserve">│   ├── fear/     </w:t>
+            </w:r>
+            <w:proofErr w:type="gramStart"/>
             <w:r>
               <w:rPr>
                 <w:rFonts w:ascii="Courier New" w:eastAsia="Courier New" w:hAnsi="Courier New" w:cs="Courier New"/>
@@ -972,9 +764,9 @@
                 <w:szCs w:val="20"/>
                 <w:lang w:val="en-US"/>
               </w:rPr>
-              <w:t>│   ├── happiness/</w:t>
-            </w:r>
-            <w:proofErr w:type="gramStart"/>
+              <w:t xml:space="preserve">   (</w:t>
+            </w:r>
+            <w:proofErr w:type="gramEnd"/>
             <w:r>
               <w:rPr>
                 <w:rFonts w:ascii="Courier New" w:eastAsia="Courier New" w:hAnsi="Courier New" w:cs="Courier New"/>
@@ -983,9 +775,8 @@
                 <w:szCs w:val="20"/>
                 <w:lang w:val="en-US"/>
               </w:rPr>
-              <w:t xml:space="preserve">   (</w:t>
-            </w:r>
-            <w:proofErr w:type="gramEnd"/>
+              <w:t>fear_01.png … fear_</w:t>
+            </w:r>
             <w:r>
               <w:rPr>
                 <w:rFonts w:ascii="Courier New" w:eastAsia="Courier New" w:hAnsi="Courier New" w:cs="Courier New"/>
@@ -994,16 +785,8 @@
                 <w:szCs w:val="20"/>
                 <w:lang w:val="en-US"/>
               </w:rPr>
-              <w:t>happiness_01.png … happiness_40.png)</w:t>
-            </w:r>
-          </w:p>
-          <w:p>
-            <w:pPr>
-              <w:spacing w:before="20" w:after="20"/>
-              <w:rPr>
-                <w:lang w:val="en-US"/>
-              </w:rPr>
-            </w:pPr>
+              <w:t>1</w:t>
+            </w:r>
             <w:r>
               <w:rPr>
                 <w:rFonts w:ascii="Courier New" w:eastAsia="Courier New" w:hAnsi="Courier New" w:cs="Courier New"/>
@@ -1012,9 +795,16 @@
                 <w:szCs w:val="20"/>
                 <w:lang w:val="en-US"/>
               </w:rPr>
-              <w:t xml:space="preserve">│   ├── sadness/  </w:t>
-            </w:r>
-            <w:proofErr w:type="gramStart"/>
+              <w:t>0.png)</w:t>
+            </w:r>
+          </w:p>
+          <w:p>
+            <w:pPr>
+              <w:spacing w:before="20" w:after="20"/>
+              <w:rPr>
+                <w:lang w:val="en-US"/>
+              </w:rPr>
+            </w:pPr>
             <w:r>
               <w:rPr>
                 <w:rFonts w:ascii="Courier New" w:eastAsia="Courier New" w:hAnsi="Courier New" w:cs="Courier New"/>
@@ -1023,9 +813,9 @@
                 <w:szCs w:val="20"/>
                 <w:lang w:val="en-US"/>
               </w:rPr>
-              <w:t xml:space="preserve">   (</w:t>
-            </w:r>
-            <w:proofErr w:type="gramEnd"/>
+              <w:t>│   ├── happiness/</w:t>
+            </w:r>
+            <w:proofErr w:type="gramStart"/>
             <w:r>
               <w:rPr>
                 <w:rFonts w:ascii="Courier New" w:eastAsia="Courier New" w:hAnsi="Courier New" w:cs="Courier New"/>
@@ -1034,42 +824,90 @@
                 <w:szCs w:val="20"/>
                 <w:lang w:val="en-US"/>
               </w:rPr>
-              <w:t>sadness_01.png … sadness_40.png)</w:t>
-            </w:r>
-          </w:p>
-          <w:p>
-            <w:pPr>
-              <w:spacing w:before="20" w:after="20"/>
-            </w:pPr>
+              <w:t xml:space="preserve">   (</w:t>
+            </w:r>
+            <w:proofErr w:type="gramEnd"/>
             <w:r>
               <w:rPr>
                 <w:rFonts w:ascii="Courier New" w:eastAsia="Courier New" w:hAnsi="Courier New" w:cs="Courier New"/>
                 <w:color w:val="000000"/>
                 <w:sz w:val="20"/>
                 <w:szCs w:val="20"/>
-              </w:rPr>
-              <w:lastRenderedPageBreak/>
-              <w:t xml:space="preserve">│   └── </w:t>
-            </w:r>
-            <w:proofErr w:type="spellStart"/>
+                <w:lang w:val="en-US"/>
+              </w:rPr>
+              <w:t>happiness_01.png … happiness_</w:t>
+            </w:r>
             <w:r>
               <w:rPr>
                 <w:rFonts w:ascii="Courier New" w:eastAsia="Courier New" w:hAnsi="Courier New" w:cs="Courier New"/>
                 <w:color w:val="000000"/>
                 <w:sz w:val="20"/>
                 <w:szCs w:val="20"/>
-              </w:rPr>
-              <w:t>practice</w:t>
-            </w:r>
-            <w:proofErr w:type="spellEnd"/>
+                <w:lang w:val="en-US"/>
+              </w:rPr>
+              <w:t>1</w:t>
+            </w:r>
             <w:r>
               <w:rPr>
                 <w:rFonts w:ascii="Courier New" w:eastAsia="Courier New" w:hAnsi="Courier New" w:cs="Courier New"/>
                 <w:color w:val="000000"/>
                 <w:sz w:val="20"/>
                 <w:szCs w:val="20"/>
-              </w:rPr>
-              <w:t>/</w:t>
+                <w:lang w:val="en-US"/>
+              </w:rPr>
+              <w:t>0.png)</w:t>
+            </w:r>
+          </w:p>
+          <w:p>
+            <w:pPr>
+              <w:spacing w:before="20" w:after="20"/>
+              <w:rPr>
+                <w:lang w:val="en-US"/>
+              </w:rPr>
+            </w:pPr>
+            <w:r>
+              <w:rPr>
+                <w:rFonts w:ascii="Courier New" w:eastAsia="Courier New" w:hAnsi="Courier New" w:cs="Courier New"/>
+                <w:color w:val="000000"/>
+                <w:sz w:val="20"/>
+                <w:szCs w:val="20"/>
+                <w:lang w:val="en-US"/>
+              </w:rPr>
+              <w:t>│   ├── sadness/     (sadness_01.png … sadness_</w:t>
+            </w:r>
+            <w:r>
+              <w:rPr>
+                <w:rFonts w:ascii="Courier New" w:eastAsia="Courier New" w:hAnsi="Courier New" w:cs="Courier New"/>
+                <w:color w:val="000000"/>
+                <w:sz w:val="20"/>
+                <w:szCs w:val="20"/>
+                <w:lang w:val="en-US"/>
+              </w:rPr>
+              <w:t>1</w:t>
+            </w:r>
+            <w:r>
+              <w:rPr>
+                <w:rFonts w:ascii="Courier New" w:eastAsia="Courier New" w:hAnsi="Courier New" w:cs="Courier New"/>
+                <w:color w:val="000000"/>
+                <w:sz w:val="20"/>
+                <w:szCs w:val="20"/>
+                <w:lang w:val="en-US"/>
+              </w:rPr>
+              <w:t>0.png)</w:t>
+            </w:r>
+          </w:p>
+          <w:p>
+            <w:pPr>
+              <w:spacing w:before="20" w:after="20"/>
+            </w:pPr>
+            <w:r>
+              <w:rPr>
+                <w:rFonts w:ascii="Courier New" w:eastAsia="Courier New" w:hAnsi="Courier New" w:cs="Courier New"/>
+                <w:color w:val="000000"/>
+                <w:sz w:val="20"/>
+                <w:szCs w:val="20"/>
+              </w:rPr>
+              <w:t>│   └── practice/</w:t>
             </w:r>
           </w:p>
           <w:p>
@@ -1295,23 +1133,13 @@
             <w:pPr>
               <w:jc w:val="both"/>
             </w:pPr>
-            <w:proofErr w:type="spellStart"/>
             <w:r>
               <w:rPr>
                 <w:color w:val="000000"/>
                 <w:sz w:val="22"/>
                 <w:szCs w:val="22"/>
               </w:rPr>
-              <w:t>Forced-choice</w:t>
-            </w:r>
-            <w:proofErr w:type="spellEnd"/>
-            <w:r>
-              <w:rPr>
-                <w:color w:val="000000"/>
-                <w:sz w:val="22"/>
-                <w:szCs w:val="22"/>
-              </w:rPr>
-              <w:t>, categorización emocional</w:t>
+              <w:t>Forced-choice, categorización emocional</w:t>
             </w:r>
           </w:p>
         </w:tc>
@@ -1439,61 +1267,7 @@
                 <w:sz w:val="22"/>
                 <w:szCs w:val="22"/>
               </w:rPr>
-              <w:t>F (</w:t>
-            </w:r>
-            <w:proofErr w:type="gramStart"/>
-            <w:r>
-              <w:rPr>
-                <w:color w:val="000000"/>
-                <w:sz w:val="22"/>
-                <w:szCs w:val="22"/>
-              </w:rPr>
-              <w:t>alegría)  ·</w:t>
-            </w:r>
-            <w:proofErr w:type="gramEnd"/>
-            <w:r>
-              <w:rPr>
-                <w:color w:val="000000"/>
-                <w:sz w:val="22"/>
-                <w:szCs w:val="22"/>
-              </w:rPr>
-              <w:t xml:space="preserve">  G (</w:t>
-            </w:r>
-            <w:proofErr w:type="gramStart"/>
-            <w:r>
-              <w:rPr>
-                <w:color w:val="000000"/>
-                <w:sz w:val="22"/>
-                <w:szCs w:val="22"/>
-              </w:rPr>
-              <w:t>tristeza)  ·</w:t>
-            </w:r>
-            <w:proofErr w:type="gramEnd"/>
-            <w:r>
-              <w:rPr>
-                <w:color w:val="000000"/>
-                <w:sz w:val="22"/>
-                <w:szCs w:val="22"/>
-              </w:rPr>
-              <w:t xml:space="preserve">  H (</w:t>
-            </w:r>
-            <w:proofErr w:type="gramStart"/>
-            <w:r>
-              <w:rPr>
-                <w:color w:val="000000"/>
-                <w:sz w:val="22"/>
-                <w:szCs w:val="22"/>
-              </w:rPr>
-              <w:t>ira)  ·</w:t>
-            </w:r>
-            <w:proofErr w:type="gramEnd"/>
-            <w:r>
-              <w:rPr>
-                <w:color w:val="000000"/>
-                <w:sz w:val="22"/>
-                <w:szCs w:val="22"/>
-              </w:rPr>
-              <w:t xml:space="preserve">  J (miedo)</w:t>
+              <w:t>F (alegría)  ·  G (tristeza)  ·  H (ira)  ·  J (miedo)</w:t>
             </w:r>
           </w:p>
         </w:tc>
@@ -1520,23 +1294,13 @@
             <w:pPr>
               <w:jc w:val="both"/>
             </w:pPr>
-            <w:proofErr w:type="spellStart"/>
             <w:r>
               <w:rPr>
                 <w:color w:val="000000"/>
                 <w:sz w:val="22"/>
                 <w:szCs w:val="22"/>
               </w:rPr>
-              <w:t>Trials</w:t>
-            </w:r>
-            <w:proofErr w:type="spellEnd"/>
-            <w:r>
-              <w:rPr>
-                <w:color w:val="000000"/>
-                <w:sz w:val="22"/>
-                <w:szCs w:val="22"/>
-              </w:rPr>
-              <w:t xml:space="preserve"> de práctica</w:t>
+              <w:t>Trials de práctica</w:t>
             </w:r>
           </w:p>
         </w:tc>
@@ -1594,23 +1358,13 @@
             <w:pPr>
               <w:jc w:val="both"/>
             </w:pPr>
-            <w:proofErr w:type="spellStart"/>
             <w:r>
               <w:rPr>
                 <w:color w:val="000000"/>
                 <w:sz w:val="22"/>
                 <w:szCs w:val="22"/>
               </w:rPr>
-              <w:t>Trials</w:t>
-            </w:r>
-            <w:proofErr w:type="spellEnd"/>
-            <w:r>
-              <w:rPr>
-                <w:color w:val="000000"/>
-                <w:sz w:val="22"/>
-                <w:szCs w:val="22"/>
-              </w:rPr>
-              <w:t xml:space="preserve"> experimentales</w:t>
+              <w:t>Trials experimentales</w:t>
             </w:r>
           </w:p>
         </w:tc>
@@ -1674,7 +1428,7 @@
                 <w:sz w:val="22"/>
                 <w:szCs w:val="22"/>
               </w:rPr>
-              <w:t>Presentación del estímulo</w:t>
+              <w:t>Cruz de fijación</w:t>
             </w:r>
           </w:p>
         </w:tc>
@@ -1705,25 +1459,7 @@
                 <w:sz w:val="22"/>
                 <w:szCs w:val="22"/>
               </w:rPr>
-              <w:t>Free-</w:t>
-            </w:r>
-            <w:proofErr w:type="spellStart"/>
-            <w:r>
-              <w:rPr>
-                <w:color w:val="000000"/>
-                <w:sz w:val="22"/>
-                <w:szCs w:val="22"/>
-              </w:rPr>
-              <w:t>viewing</w:t>
-            </w:r>
-            <w:proofErr w:type="spellEnd"/>
-            <w:r>
-              <w:rPr>
-                <w:color w:val="000000"/>
-                <w:sz w:val="22"/>
-                <w:szCs w:val="22"/>
-              </w:rPr>
-              <w:t xml:space="preserve"> (hasta respuesta del participante)</w:t>
+              <w:t>500 ms, cruz blanca, antes de cada estímulo</w:t>
             </w:r>
           </w:p>
         </w:tc>
@@ -1756,7 +1492,7 @@
                 <w:sz w:val="22"/>
                 <w:szCs w:val="22"/>
               </w:rPr>
-              <w:t>ITI</w:t>
+              <w:t>Presentación del estímulo</w:t>
             </w:r>
           </w:p>
         </w:tc>
@@ -1787,7 +1523,7 @@
                 <w:sz w:val="22"/>
                 <w:szCs w:val="22"/>
               </w:rPr>
-              <w:t>500 ms</w:t>
+              <w:t>Free-viewing (hasta respuesta del participante)</w:t>
             </w:r>
           </w:p>
         </w:tc>
@@ -1814,16 +1550,14 @@
             <w:pPr>
               <w:jc w:val="both"/>
             </w:pPr>
-            <w:proofErr w:type="spellStart"/>
             <w:r>
               <w:rPr>
                 <w:color w:val="000000"/>
                 <w:sz w:val="22"/>
                 <w:szCs w:val="22"/>
               </w:rPr>
-              <w:t>Feedback</w:t>
-            </w:r>
-            <w:proofErr w:type="spellEnd"/>
+              <w:t>ITI</w:t>
+            </w:r>
           </w:p>
         </w:tc>
         <w:tc>
@@ -1853,6 +1587,70 @@
                 <w:sz w:val="22"/>
                 <w:szCs w:val="22"/>
               </w:rPr>
+              <w:t>500 ms</w:t>
+            </w:r>
+          </w:p>
+        </w:tc>
+      </w:tr>
+      <w:tr>
+        <w:tc>
+          <w:tcPr>
+            <w:tcW w:w="4200" w:type="dxa"/>
+            <w:tcBorders>
+              <w:top w:val="none" w:sz="0" w:space="0" w:color="FFFFFF"/>
+              <w:left w:val="none" w:sz="0" w:space="0" w:color="FFFFFF"/>
+              <w:bottom w:val="none" w:sz="0" w:space="0" w:color="FFFFFF"/>
+              <w:right w:val="none" w:sz="0" w:space="0" w:color="FFFFFF"/>
+            </w:tcBorders>
+            <w:shd w:val="clear" w:color="auto" w:fill="FFFFFF"/>
+            <w:tcMar>
+              <w:top w:w="60" w:type="dxa"/>
+              <w:left w:w="0" w:type="dxa"/>
+              <w:bottom w:w="60" w:type="dxa"/>
+              <w:right w:w="120" w:type="dxa"/>
+            </w:tcMar>
+          </w:tcPr>
+          <w:p>
+            <w:pPr>
+              <w:jc w:val="both"/>
+            </w:pPr>
+            <w:r>
+              <w:rPr>
+                <w:color w:val="000000"/>
+                <w:sz w:val="22"/>
+                <w:szCs w:val="22"/>
+              </w:rPr>
+              <w:t>Feedback</w:t>
+            </w:r>
+          </w:p>
+        </w:tc>
+        <w:tc>
+          <w:tcPr>
+            <w:tcW w:w="4826" w:type="dxa"/>
+            <w:tcBorders>
+              <w:top w:val="none" w:sz="0" w:space="0" w:color="FFFFFF"/>
+              <w:left w:val="none" w:sz="0" w:space="0" w:color="FFFFFF"/>
+              <w:bottom w:val="none" w:sz="0" w:space="0" w:color="FFFFFF"/>
+              <w:right w:val="none" w:sz="0" w:space="0" w:color="FFFFFF"/>
+            </w:tcBorders>
+            <w:shd w:val="clear" w:color="auto" w:fill="FFFFFF"/>
+            <w:tcMar>
+              <w:top w:w="60" w:type="dxa"/>
+              <w:left w:w="0" w:type="dxa"/>
+              <w:bottom w:w="60" w:type="dxa"/>
+              <w:right w:w="120" w:type="dxa"/>
+            </w:tcMar>
+          </w:tcPr>
+          <w:p>
+            <w:pPr>
+              <w:jc w:val="both"/>
+            </w:pPr>
+            <w:r>
+              <w:rPr>
+                <w:color w:val="000000"/>
+                <w:sz w:val="22"/>
+                <w:szCs w:val="22"/>
+              </w:rPr>
               <w:t>Solo en fase de práctica</w:t>
             </w:r>
           </w:p>
@@ -1952,25 +1750,7 @@
           <w:sz w:val="20"/>
           <w:szCs w:val="20"/>
         </w:rPr>
-        <w:t xml:space="preserve">El RT se registra en milisegundos. El promedio de RT se calcula únicamente sobre los </w:t>
-      </w:r>
-      <w:proofErr w:type="spellStart"/>
-      <w:r>
-        <w:rPr>
-          <w:color w:val="000000"/>
-          <w:sz w:val="20"/>
-          <w:szCs w:val="20"/>
-        </w:rPr>
-        <w:t>trials</w:t>
-      </w:r>
-      <w:proofErr w:type="spellEnd"/>
-      <w:r>
-        <w:rPr>
-          <w:color w:val="000000"/>
-          <w:sz w:val="20"/>
-          <w:szCs w:val="20"/>
-        </w:rPr>
-        <w:t xml:space="preserve"> correctos.</w:t>
+        <w:t>El RT se registra en milisegundos. El promedio de RT se calcula únicamente sobre los trials correctos.</w:t>
       </w:r>
     </w:p>
     <w:p>
@@ -1984,16 +1764,8 @@
         <w:rPr>
           <w:color w:val="000000"/>
         </w:rPr>
-        <w:t xml:space="preserve">Flujo de </w:t>
-      </w:r>
-      <w:proofErr w:type="spellStart"/>
-      <w:r>
-        <w:rPr>
-          <w:color w:val="000000"/>
-        </w:rPr>
-        <w:t>routines</w:t>
-      </w:r>
-      <w:proofErr w:type="spellEnd"/>
+        <w:t>Flujo de routines</w:t>
+      </w:r>
     </w:p>
     <w:p>
       <w:pPr>
@@ -2024,25 +1796,7 @@
           <w:iCs/>
           <w:color w:val="000000"/>
         </w:rPr>
-        <w:t xml:space="preserve">Gráfico del flujo de </w:t>
-      </w:r>
-      <w:proofErr w:type="spellStart"/>
-      <w:r>
-        <w:rPr>
-          <w:i/>
-          <w:iCs/>
-          <w:color w:val="000000"/>
-        </w:rPr>
-        <w:t>routines</w:t>
-      </w:r>
-      <w:proofErr w:type="spellEnd"/>
-      <w:r>
-        <w:rPr>
-          <w:i/>
-          <w:iCs/>
-          <w:color w:val="000000"/>
-        </w:rPr>
-        <w:t xml:space="preserve"> de la tarea de categorización emocional</w:t>
+        <w:t>Gráfico del flujo de routines de la tarea de categorización emocional</w:t>
       </w:r>
     </w:p>
     <w:p>
@@ -2054,10 +1808,10 @@
           <w:noProof/>
         </w:rPr>
         <w:drawing>
-          <wp:inline distT="0" distB="0" distL="0" distR="0" wp14:anchorId="769EAFF2" wp14:editId="1B62D1C7">
-            <wp:extent cx="5731510" cy="945515"/>
+          <wp:inline distT="0" distB="0" distL="0" distR="0" wp14:anchorId="261C61F9" wp14:editId="5E2BADFA">
+            <wp:extent cx="5731510" cy="592055"/>
             <wp:effectExtent l="0" t="0" r="2540" b="6985"/>
-            <wp:docPr id="672043739" name="Imagen 1"/>
+            <wp:docPr id="100867722" name="Imagen 1"/>
             <wp:cNvGraphicFramePr>
               <a:graphicFrameLocks xmlns:a="http://schemas.openxmlformats.org/drawingml/2006/main" noChangeAspect="1"/>
             </wp:cNvGraphicFramePr>
@@ -2065,7 +1819,7 @@
               <a:graphicData uri="http://schemas.openxmlformats.org/drawingml/2006/picture">
                 <pic:pic xmlns:pic="http://schemas.openxmlformats.org/drawingml/2006/picture">
                   <pic:nvPicPr>
-                    <pic:cNvPr id="672043739" name="Imagen 672043739"/>
+                    <pic:cNvPr id="100867722" name="Imagen 100867722"/>
                     <pic:cNvPicPr/>
                   </pic:nvPicPr>
                   <pic:blipFill>
@@ -2083,7 +1837,7 @@
                   <pic:spPr>
                     <a:xfrm>
                       <a:off x="0" y="0"/>
-                      <a:ext cx="5731510" cy="945515"/>
+                      <a:ext cx="5731510" cy="592055"/>
                     </a:xfrm>
                     <a:prstGeom prst="rect">
                       <a:avLst/>
@@ -2122,35 +1876,7 @@
         <w:rPr>
           <w:color w:val="000000"/>
         </w:rPr>
-        <w:t xml:space="preserve">La tarea usa dos archivos de condiciones. A diferencia de la fase experimental, la fase de práctica no utiliza imágenes sino palabras escritas, por lo que cada fase emplea un componente distinto en </w:t>
-      </w:r>
-      <w:proofErr w:type="spellStart"/>
-      <w:r>
-        <w:rPr>
-          <w:color w:val="000000"/>
-        </w:rPr>
-        <w:t>PsychoPy</w:t>
-      </w:r>
-      <w:proofErr w:type="spellEnd"/>
-      <w:r>
-        <w:rPr>
-          <w:color w:val="000000"/>
-        </w:rPr>
-        <w:t xml:space="preserve">: Text en práctica e </w:t>
-      </w:r>
-      <w:proofErr w:type="spellStart"/>
-      <w:r>
-        <w:rPr>
-          <w:color w:val="000000"/>
-        </w:rPr>
-        <w:t>Image</w:t>
-      </w:r>
-      <w:proofErr w:type="spellEnd"/>
-      <w:r>
-        <w:rPr>
-          <w:color w:val="000000"/>
-        </w:rPr>
-        <w:t xml:space="preserve"> en experimental.</w:t>
+        <w:t>La tarea usa dos archivos de condiciones. A diferencia de la fase experimental, la fase de práctica no utiliza imágenes sino palabras escritas, por lo que cada fase emplea un componente distinto en PsychoPy: Text en práctica e Image en experimental.</w:t>
       </w:r>
     </w:p>
     <w:p>
@@ -2231,6 +1957,7 @@
                 <w:sz w:val="22"/>
                 <w:szCs w:val="22"/>
               </w:rPr>
+              <w:lastRenderedPageBreak/>
               <w:t>Columna</w:t>
             </w:r>
           </w:p>
@@ -2292,11 +2019,9 @@
             </w:tcMar>
           </w:tcPr>
           <w:p>
-            <w:proofErr w:type="spellStart"/>
             <w:r>
               <w:t>id_p</w:t>
             </w:r>
-            <w:proofErr w:type="spellEnd"/>
           </w:p>
         </w:tc>
         <w:tc>
@@ -2342,17 +2067,14 @@
             </w:tcMar>
           </w:tcPr>
           <w:p>
-            <w:proofErr w:type="spellStart"/>
             <w:r>
               <w:rPr>
                 <w:color w:val="000000"/>
                 <w:sz w:val="22"/>
                 <w:szCs w:val="22"/>
               </w:rPr>
-              <w:lastRenderedPageBreak/>
               <w:t>palabra_p</w:t>
             </w:r>
-            <w:proofErr w:type="spellEnd"/>
           </w:p>
         </w:tc>
         <w:tc>
@@ -2401,7 +2123,6 @@
             </w:tcMar>
           </w:tcPr>
           <w:p>
-            <w:proofErr w:type="spellStart"/>
             <w:r>
               <w:rPr>
                 <w:color w:val="000000"/>
@@ -2410,7 +2131,6 @@
               </w:rPr>
               <w:t>emocion_p</w:t>
             </w:r>
-            <w:proofErr w:type="spellEnd"/>
           </w:p>
         </w:tc>
         <w:tc>
@@ -2456,7 +2176,6 @@
             </w:tcMar>
           </w:tcPr>
           <w:p>
-            <w:proofErr w:type="spellStart"/>
             <w:r>
               <w:rPr>
                 <w:color w:val="000000"/>
@@ -2465,7 +2184,6 @@
               </w:rPr>
               <w:t>tecla_correcta_p</w:t>
             </w:r>
-            <w:proofErr w:type="spellEnd"/>
           </w:p>
         </w:tc>
         <w:tc>
@@ -2514,61 +2232,7 @@
           <w:sz w:val="20"/>
           <w:szCs w:val="20"/>
         </w:rPr>
-        <w:t>En la fase de práctica el estímulo es una palabra escrita, no una imagen. El componente Text debe tener: Text = $</w:t>
-      </w:r>
-      <w:proofErr w:type="spellStart"/>
-      <w:r>
-        <w:rPr>
-          <w:color w:val="000000"/>
-          <w:sz w:val="20"/>
-          <w:szCs w:val="20"/>
-        </w:rPr>
-        <w:t>palabra_p</w:t>
-      </w:r>
-      <w:proofErr w:type="spellEnd"/>
-      <w:r>
-        <w:rPr>
-          <w:color w:val="000000"/>
-          <w:sz w:val="20"/>
-          <w:szCs w:val="20"/>
-        </w:rPr>
-        <w:t xml:space="preserve"> | Set </w:t>
-      </w:r>
-      <w:proofErr w:type="spellStart"/>
-      <w:r>
-        <w:rPr>
-          <w:color w:val="000000"/>
-          <w:sz w:val="20"/>
-          <w:szCs w:val="20"/>
-        </w:rPr>
-        <w:t>every</w:t>
-      </w:r>
-      <w:proofErr w:type="spellEnd"/>
-      <w:r>
-        <w:rPr>
-          <w:color w:val="000000"/>
-          <w:sz w:val="20"/>
-          <w:szCs w:val="20"/>
-        </w:rPr>
-        <w:t xml:space="preserve"> </w:t>
-      </w:r>
-      <w:proofErr w:type="spellStart"/>
-      <w:r>
-        <w:rPr>
-          <w:color w:val="000000"/>
-          <w:sz w:val="20"/>
-          <w:szCs w:val="20"/>
-        </w:rPr>
-        <w:t>repeat</w:t>
-      </w:r>
-      <w:proofErr w:type="spellEnd"/>
-      <w:r>
-        <w:rPr>
-          <w:color w:val="000000"/>
-          <w:sz w:val="20"/>
-          <w:szCs w:val="20"/>
-        </w:rPr>
-        <w:t xml:space="preserve"> activado.</w:t>
+        <w:t>En la fase de práctica el estímulo es una palabra escrita, no una imagen. El componente Text debe tener: Text = $palabra_p | Set every repeat activado.</w:t>
       </w:r>
     </w:p>
     <w:p>
@@ -2792,15 +2456,7 @@
           </w:tcPr>
           <w:p>
             <w:r>
-              <w:t>Ruta relativa al archivo de imagen del estímulo (ej. media/</w:t>
-            </w:r>
-            <w:proofErr w:type="spellStart"/>
-            <w:r>
-              <w:t>happiness</w:t>
-            </w:r>
-            <w:proofErr w:type="spellEnd"/>
-            <w:r>
-              <w:t>/happiness_01.png)</w:t>
+              <w:t>Ruta relativa al archivo de imagen del estímulo (ej. media/happiness/happiness_01.png)</w:t>
             </w:r>
           </w:p>
         </w:tc>
@@ -2824,7 +2480,6 @@
             </w:tcMar>
           </w:tcPr>
           <w:p>
-            <w:proofErr w:type="spellStart"/>
             <w:r>
               <w:rPr>
                 <w:color w:val="000000"/>
@@ -2833,7 +2488,6 @@
               </w:rPr>
               <w:t>emocion</w:t>
             </w:r>
-            <w:proofErr w:type="spellEnd"/>
           </w:p>
         </w:tc>
         <w:tc>
@@ -2879,7 +2533,6 @@
             </w:tcMar>
           </w:tcPr>
           <w:p>
-            <w:proofErr w:type="spellStart"/>
             <w:r>
               <w:rPr>
                 <w:color w:val="000000"/>
@@ -2888,7 +2541,6 @@
               </w:rPr>
               <w:t>tecla_correcta</w:t>
             </w:r>
-            <w:proofErr w:type="spellEnd"/>
           </w:p>
         </w:tc>
         <w:tc>
@@ -2937,97 +2589,7 @@
           <w:sz w:val="20"/>
           <w:szCs w:val="20"/>
         </w:rPr>
-        <w:t xml:space="preserve">El componente </w:t>
-      </w:r>
-      <w:proofErr w:type="spellStart"/>
-      <w:r>
-        <w:rPr>
-          <w:color w:val="000000"/>
-          <w:sz w:val="20"/>
-          <w:szCs w:val="20"/>
-        </w:rPr>
-        <w:t>Image</w:t>
-      </w:r>
-      <w:proofErr w:type="spellEnd"/>
-      <w:r>
-        <w:rPr>
-          <w:color w:val="000000"/>
-          <w:sz w:val="20"/>
-          <w:szCs w:val="20"/>
-        </w:rPr>
-        <w:t xml:space="preserve"> en </w:t>
-      </w:r>
-      <w:proofErr w:type="spellStart"/>
-      <w:r>
-        <w:rPr>
-          <w:color w:val="000000"/>
-          <w:sz w:val="20"/>
-          <w:szCs w:val="20"/>
-        </w:rPr>
-        <w:t>PsychoPy</w:t>
-      </w:r>
-      <w:proofErr w:type="spellEnd"/>
-      <w:r>
-        <w:rPr>
-          <w:color w:val="000000"/>
-          <w:sz w:val="20"/>
-          <w:szCs w:val="20"/>
-        </w:rPr>
-        <w:t xml:space="preserve"> debe tener: </w:t>
-      </w:r>
-      <w:proofErr w:type="spellStart"/>
-      <w:r>
-        <w:rPr>
-          <w:color w:val="000000"/>
-          <w:sz w:val="20"/>
-          <w:szCs w:val="20"/>
-        </w:rPr>
-        <w:t>Image</w:t>
-      </w:r>
-      <w:proofErr w:type="spellEnd"/>
-      <w:r>
-        <w:rPr>
-          <w:color w:val="000000"/>
-          <w:sz w:val="20"/>
-          <w:szCs w:val="20"/>
-        </w:rPr>
-        <w:t xml:space="preserve"> = $imagen | Set </w:t>
-      </w:r>
-      <w:proofErr w:type="spellStart"/>
-      <w:r>
-        <w:rPr>
-          <w:color w:val="000000"/>
-          <w:sz w:val="20"/>
-          <w:szCs w:val="20"/>
-        </w:rPr>
-        <w:t>every</w:t>
-      </w:r>
-      <w:proofErr w:type="spellEnd"/>
-      <w:r>
-        <w:rPr>
-          <w:color w:val="000000"/>
-          <w:sz w:val="20"/>
-          <w:szCs w:val="20"/>
-        </w:rPr>
-        <w:t xml:space="preserve"> </w:t>
-      </w:r>
-      <w:proofErr w:type="spellStart"/>
-      <w:r>
-        <w:rPr>
-          <w:color w:val="000000"/>
-          <w:sz w:val="20"/>
-          <w:szCs w:val="20"/>
-        </w:rPr>
-        <w:t>repeat</w:t>
-      </w:r>
-      <w:proofErr w:type="spellEnd"/>
-      <w:r>
-        <w:rPr>
-          <w:color w:val="000000"/>
-          <w:sz w:val="20"/>
-          <w:szCs w:val="20"/>
-        </w:rPr>
-        <w:t xml:space="preserve"> activado.</w:t>
+        <w:t>El componente Image en PsychoPy debe tener: Image = $imagen | Set every repeat activado.</w:t>
       </w:r>
     </w:p>
     <w:p>
@@ -3053,35 +2615,7 @@
         <w:rPr>
           <w:color w:val="000000"/>
         </w:rPr>
-        <w:t xml:space="preserve">Las fotografías provienen del Ulima </w:t>
-      </w:r>
-      <w:proofErr w:type="spellStart"/>
-      <w:r>
-        <w:rPr>
-          <w:color w:val="000000"/>
-        </w:rPr>
-        <w:t>Emotional</w:t>
-      </w:r>
-      <w:proofErr w:type="spellEnd"/>
-      <w:r>
-        <w:rPr>
-          <w:color w:val="000000"/>
-        </w:rPr>
-        <w:t xml:space="preserve"> Faces </w:t>
-      </w:r>
-      <w:proofErr w:type="spellStart"/>
-      <w:r>
-        <w:rPr>
-          <w:color w:val="000000"/>
-        </w:rPr>
-        <w:t>Dataset</w:t>
-      </w:r>
-      <w:proofErr w:type="spellEnd"/>
-      <w:r>
-        <w:rPr>
-          <w:color w:val="000000"/>
-        </w:rPr>
-        <w:t>, un banco de imágenes de expresiones emocionales en rostros latinos desarrollado en la Universidad de Lima. Las características de las imágenes son las siguientes:</w:t>
+        <w:t>Las fotografías provienen del Ulima Emotional Faces Dataset, un banco de imágenes de expresiones emocionales en rostros latinos desarrollado en la Universidad de Lima. Las características de las imágenes son las siguientes:</w:t>
       </w:r>
     </w:p>
     <w:p>
@@ -3161,16 +2695,8 @@
           <w:color w:val="000000"/>
         </w:rPr>
         <w:tab/>
-        <w:t xml:space="preserve">Tamaño estandarizado: 600 × 800 </w:t>
-      </w:r>
-      <w:proofErr w:type="spellStart"/>
-      <w:r>
-        <w:rPr>
-          <w:color w:val="000000"/>
-        </w:rPr>
-        <w:t>px</w:t>
-      </w:r>
-      <w:proofErr w:type="spellEnd"/>
+        <w:t>Tamaño estandarizado: 600 × 800 px</w:t>
+      </w:r>
     </w:p>
     <w:p>
       <w:pPr>
@@ -3217,21 +2743,7 @@
         <w:rPr>
           <w:color w:val="000000"/>
         </w:rPr>
-        <w:t xml:space="preserve">Una vez completada la tarea, el archivo CSV generado automáticamente por </w:t>
-      </w:r>
-      <w:proofErr w:type="spellStart"/>
-      <w:r>
-        <w:rPr>
-          <w:color w:val="000000"/>
-        </w:rPr>
-        <w:t>PsychoPy</w:t>
-      </w:r>
-      <w:proofErr w:type="spellEnd"/>
-      <w:r>
-        <w:rPr>
-          <w:color w:val="000000"/>
-        </w:rPr>
-        <w:t xml:space="preserve"> puede procesarse en la aplicación web del curso, sin necesidad de instalar ningún software adicional:</w:t>
+        <w:t>Una vez completada la tarea, el archivo CSV generado automáticamente por PsychoPy puede procesarse en la aplicación web del curso, sin necesidad de instalar ningún software adicional:</w:t>
       </w:r>
     </w:p>
     <w:p>
@@ -3282,6 +2794,7 @@
         <w:rPr>
           <w:color w:val="000000"/>
         </w:rPr>
+        <w:lastRenderedPageBreak/>
         <w:t>1.</w:t>
       </w:r>
       <w:r>
@@ -3308,21 +2821,7 @@
           <w:color w:val="000000"/>
         </w:rPr>
         <w:tab/>
-        <w:t>Arrastrar el archivo .</w:t>
-      </w:r>
-      <w:proofErr w:type="spellStart"/>
-      <w:r>
-        <w:rPr>
-          <w:color w:val="000000"/>
-        </w:rPr>
-        <w:t>csv</w:t>
-      </w:r>
-      <w:proofErr w:type="spellEnd"/>
-      <w:r>
-        <w:rPr>
-          <w:color w:val="000000"/>
-        </w:rPr>
-        <w:t xml:space="preserve"> al área de carga.</w:t>
+        <w:t>Arrastrar el archivo .csv al área de carga.</w:t>
       </w:r>
     </w:p>
     <w:p>
@@ -3334,7 +2833,6 @@
         <w:rPr>
           <w:color w:val="000000"/>
         </w:rPr>
-        <w:lastRenderedPageBreak/>
         <w:t>3.</w:t>
       </w:r>
       <w:r>
@@ -3427,43 +2925,7 @@
                 <w:sz w:val="22"/>
                 <w:szCs w:val="22"/>
               </w:rPr>
-              <w:t xml:space="preserve">La aplicación procesa únicamente los </w:t>
-            </w:r>
-            <w:proofErr w:type="spellStart"/>
-            <w:r>
-              <w:rPr>
-                <w:color w:val="000000"/>
-                <w:sz w:val="22"/>
-                <w:szCs w:val="22"/>
-              </w:rPr>
-              <w:t>trials</w:t>
-            </w:r>
-            <w:proofErr w:type="spellEnd"/>
-            <w:r>
-              <w:rPr>
-                <w:color w:val="000000"/>
-                <w:sz w:val="22"/>
-                <w:szCs w:val="22"/>
-              </w:rPr>
-              <w:t xml:space="preserve"> de la fase experimental. Los </w:t>
-            </w:r>
-            <w:proofErr w:type="spellStart"/>
-            <w:r>
-              <w:rPr>
-                <w:color w:val="000000"/>
-                <w:sz w:val="22"/>
-                <w:szCs w:val="22"/>
-              </w:rPr>
-              <w:t>trials</w:t>
-            </w:r>
-            <w:proofErr w:type="spellEnd"/>
-            <w:r>
-              <w:rPr>
-                <w:color w:val="000000"/>
-                <w:sz w:val="22"/>
-                <w:szCs w:val="22"/>
-              </w:rPr>
-              <w:t xml:space="preserve"> de práctica no se incluyen en el análisis.</w:t>
+              <w:t>La aplicación procesa únicamente los trials de la fase experimental. Los trials de práctica no se incluyen en el análisis.</w:t>
             </w:r>
           </w:p>
         </w:tc>
@@ -3561,77 +3023,7 @@
         <w:rPr>
           <w:color w:val="000000"/>
         </w:rPr>
-        <w:t xml:space="preserve">Suni </w:t>
-      </w:r>
-      <w:proofErr w:type="spellStart"/>
-      <w:r>
-        <w:rPr>
-          <w:color w:val="000000"/>
-        </w:rPr>
-        <w:t>Lopez</w:t>
-      </w:r>
-      <w:proofErr w:type="spellEnd"/>
-      <w:r>
-        <w:rPr>
-          <w:color w:val="000000"/>
-        </w:rPr>
-        <w:t xml:space="preserve">, F., </w:t>
-      </w:r>
-      <w:proofErr w:type="spellStart"/>
-      <w:r>
-        <w:rPr>
-          <w:color w:val="000000"/>
-        </w:rPr>
-        <w:t>Lopez</w:t>
-      </w:r>
-      <w:proofErr w:type="spellEnd"/>
-      <w:r>
-        <w:rPr>
-          <w:color w:val="000000"/>
-        </w:rPr>
-        <w:t xml:space="preserve"> Terrones, M. C., Henostroza Mesones, F., Guzman </w:t>
-      </w:r>
-      <w:proofErr w:type="spellStart"/>
-      <w:r>
-        <w:rPr>
-          <w:color w:val="000000"/>
-        </w:rPr>
-        <w:t>Martinez</w:t>
-      </w:r>
-      <w:proofErr w:type="spellEnd"/>
-      <w:r>
-        <w:rPr>
-          <w:color w:val="000000"/>
-        </w:rPr>
-        <w:t xml:space="preserve">, J. M., </w:t>
-      </w:r>
-      <w:proofErr w:type="spellStart"/>
-      <w:r>
-        <w:rPr>
-          <w:color w:val="000000"/>
-        </w:rPr>
-        <w:t>Wissar</w:t>
-      </w:r>
-      <w:proofErr w:type="spellEnd"/>
-      <w:r>
-        <w:rPr>
-          <w:color w:val="000000"/>
-        </w:rPr>
-        <w:t xml:space="preserve"> </w:t>
-      </w:r>
-      <w:proofErr w:type="spellStart"/>
-      <w:r>
-        <w:rPr>
-          <w:color w:val="000000"/>
-        </w:rPr>
-        <w:t>Rodriguez</w:t>
-      </w:r>
-      <w:proofErr w:type="spellEnd"/>
-      <w:r>
-        <w:rPr>
-          <w:color w:val="000000"/>
-        </w:rPr>
-        <w:t xml:space="preserve">, J. E., Pineda Palomino, D. A., &amp; Sánchez López, Á. (2024-2025). </w:t>
+        <w:t xml:space="preserve">Suni Lopez, F., Lopez Terrones, M. C., Henostroza Mesones, F., Guzman Martinez, J. M., Wissar Rodriguez, J. E., Pineda Palomino, D. A., &amp; Sánchez López, Á. (2024-2025). </w:t>
       </w:r>
       <w:r>
         <w:rPr>
@@ -3639,79 +3031,7 @@
           <w:iCs/>
           <w:color w:val="000000"/>
         </w:rPr>
-        <w:t xml:space="preserve">Ulima </w:t>
-      </w:r>
-      <w:proofErr w:type="spellStart"/>
-      <w:r>
-        <w:rPr>
-          <w:i/>
-          <w:iCs/>
-          <w:color w:val="000000"/>
-        </w:rPr>
-        <w:t>Emotional</w:t>
-      </w:r>
-      <w:proofErr w:type="spellEnd"/>
-      <w:r>
-        <w:rPr>
-          <w:i/>
-          <w:iCs/>
-          <w:color w:val="000000"/>
-        </w:rPr>
-        <w:t xml:space="preserve"> Faces </w:t>
-      </w:r>
-      <w:proofErr w:type="spellStart"/>
-      <w:r>
-        <w:rPr>
-          <w:i/>
-          <w:iCs/>
-          <w:color w:val="000000"/>
-        </w:rPr>
-        <w:t>Dataset</w:t>
-      </w:r>
-      <w:proofErr w:type="spellEnd"/>
-      <w:r>
-        <w:rPr>
-          <w:i/>
-          <w:iCs/>
-          <w:color w:val="000000"/>
-        </w:rPr>
-        <w:t xml:space="preserve">: un enfoque computacional para la creación de un </w:t>
-      </w:r>
-      <w:proofErr w:type="spellStart"/>
-      <w:r>
-        <w:rPr>
-          <w:i/>
-          <w:iCs/>
-          <w:color w:val="000000"/>
-        </w:rPr>
-        <w:t>dataset</w:t>
-      </w:r>
-      <w:proofErr w:type="spellEnd"/>
-      <w:r>
-        <w:rPr>
-          <w:i/>
-          <w:iCs/>
-          <w:color w:val="000000"/>
-        </w:rPr>
-        <w:t xml:space="preserve"> de expresiones emocionales en rostros latinos utilizando análisis biométrico y machine </w:t>
-      </w:r>
-      <w:proofErr w:type="spellStart"/>
-      <w:r>
-        <w:rPr>
-          <w:i/>
-          <w:iCs/>
-          <w:color w:val="000000"/>
-        </w:rPr>
-        <w:t>learning</w:t>
-      </w:r>
-      <w:proofErr w:type="spellEnd"/>
-      <w:r>
-        <w:rPr>
-          <w:i/>
-          <w:iCs/>
-          <w:color w:val="000000"/>
-        </w:rPr>
-        <w:t>.</w:t>
+        <w:t>Ulima Emotional Faces Dataset: un enfoque computacional para la creación de un dataset de expresiones emocionales en rostros latinos utilizando análisis biométrico y machine learning.</w:t>
       </w:r>
       <w:r>
         <w:rPr>
@@ -3732,7 +3052,7 @@
 </file>
 
 <file path=word/endnotes.xml><?xml version="1.0" encoding="utf-8"?>
-<w:endnotes xmlns:wpc="http://schemas.microsoft.com/office/word/2010/wordprocessingCanvas" xmlns:cx="http://schemas.microsoft.com/office/drawing/2014/chartex" xmlns:cx1="http://schemas.microsoft.com/office/drawing/2015/9/8/chartex" xmlns:cx2="http://schemas.microsoft.com/office/drawing/2015/10/21/chartex" xmlns:cx3="http://schemas.microsoft.com/office/drawing/2016/5/9/chartex" xmlns:cx4="http://schemas.microsoft.com/office/drawing/2016/5/10/chartex" xmlns:cx5="http://schemas.microsoft.com/office/drawing/2016/5/11/chartex" xmlns:cx6="http://schemas.microsoft.com/office/drawing/2016/5/12/chartex" xmlns:cx7="http://schemas.microsoft.com/office/drawing/2016/5/13/chartex" xmlns:cx8="http://schemas.microsoft.com/office/drawing/2016/5/14/chartex" xmlns:mc="http://schemas.openxmlformats.org/markup-compatibility/2006" xmlns:aink="http://schemas.microsoft.com/office/drawing/2016/ink" xmlns:am3d="http://schemas.microsoft.com/office/drawing/2017/model3d" xmlns:o="urn:schemas-microsoft-com:office:office" xmlns:oel="http://schemas.microsoft.com/office/2019/extlst" xmlns:r="http://schemas.openxmlformats.org/officeDocument/2006/relationships" xmlns:m="http://schemas.openxmlformats.org/officeDocument/2006/math" xmlns:v="urn:schemas-microsoft-com:vml" xmlns:wp14="http://schemas.microsoft.com/office/word/2010/wordprocessingDrawing" xmlns:wp="http://schemas.openxmlformats.org/drawingml/2006/wordprocessingDrawing" xmlns:w10="urn:schemas-microsoft-com:office:word" xmlns:w="http://schemas.openxmlformats.org/wordprocessingml/2006/main" xmlns:w14="http://schemas.microsoft.com/office/word/2010/wordml" xmlns:w15="http://schemas.microsoft.com/office/word/2012/wordml" xmlns:w16cex="http://schemas.microsoft.com/office/word/2018/wordml/cex" xmlns:w16cid="http://schemas.microsoft.com/office/word/2016/wordml/cid" xmlns:w16="http://schemas.microsoft.com/office/word/2018/wordml" xmlns:w16du="http://schemas.microsoft.com/office/word/2023/wordml/word16du" xmlns:w16sdtdh="http://schemas.microsoft.com/office/word/2020/wordml/sdtdatahash" xmlns:w16sdtfl="http://schemas.microsoft.com/office/word/2024/wordml/sdtformatlock" xmlns:w16se="http://schemas.microsoft.com/office/word/2015/wordml/symex" xmlns:wpg="http://schemas.microsoft.com/office/word/2010/wordprocessingGroup" xmlns:wpi="http://schemas.microsoft.com/office/word/2010/wordprocessingInk" xmlns:wne="http://schemas.microsoft.com/office/word/2006/wordml" xmlns:wps="http://schemas.microsoft.com/office/word/2010/wordprocessingShape" mc:Ignorable="w14 w15 w16se w16cid w16 w16cex w16sdtdh w16sdtfl w16du wp14">
+<w:endnotes xmlns:wpc="http://schemas.microsoft.com/office/word/2010/wordprocessingCanvas" xmlns:cx="http://schemas.microsoft.com/office/drawing/2014/chartex" xmlns:cx1="http://schemas.microsoft.com/office/drawing/2015/9/8/chartex" xmlns:cx2="http://schemas.microsoft.com/office/drawing/2015/10/21/chartex" xmlns:cx3="http://schemas.microsoft.com/office/drawing/2016/5/9/chartex" xmlns:cx4="http://schemas.microsoft.com/office/drawing/2016/5/10/chartex" xmlns:cx5="http://schemas.microsoft.com/office/drawing/2016/5/11/chartex" xmlns:cx6="http://schemas.microsoft.com/office/drawing/2016/5/12/chartex" xmlns:cx7="http://schemas.microsoft.com/office/drawing/2016/5/13/chartex" xmlns:cx8="http://schemas.microsoft.com/office/drawing/2016/5/14/chartex" xmlns:mc="http://schemas.openxmlformats.org/markup-compatibility/2006" xmlns:m="http://schemas.openxmlformats.org/officeDocument/2006/math" xmlns:aink="http://schemas.microsoft.com/office/drawing/2016/ink" xmlns:am3d="http://schemas.microsoft.com/office/drawing/2017/model3d" xmlns:oel="http://schemas.microsoft.com/office/2019/extlst" xmlns:r="http://schemas.openxmlformats.org/officeDocument/2006/relationships" xmlns:wp14="http://schemas.microsoft.com/office/word/2010/wordprocessingDrawing" xmlns:wp="http://schemas.openxmlformats.org/drawingml/2006/wordprocessingDrawing" xmlns:wpg="http://schemas.microsoft.com/office/word/2010/wordprocessingGroup" xmlns:wpi="http://schemas.microsoft.com/office/word/2010/wordprocessingInk" xmlns:wps="http://schemas.microsoft.com/office/word/2010/wordprocessingShape" xmlns:o="urn:schemas-microsoft-com:office:office" xmlns:v="urn:schemas-microsoft-com:vml" xmlns:w10="urn:schemas-microsoft-com:office:word" xmlns:w="http://schemas.openxmlformats.org/wordprocessingml/2006/main" xmlns:w14="http://schemas.microsoft.com/office/word/2010/wordml" xmlns:w15="http://schemas.microsoft.com/office/word/2012/wordml" xmlns:w16cex="http://schemas.microsoft.com/office/word/2018/wordml/cex" xmlns:w16cid="http://schemas.microsoft.com/office/word/2016/wordml/cid" xmlns:w16="http://schemas.microsoft.com/office/word/2018/wordml" xmlns:w16sdtdh="http://schemas.microsoft.com/office/word/2020/wordml/sdtdatahash" xmlns:w16sdtfl="http://schemas.microsoft.com/office/word/2024/wordml/sdtformatlock" xmlns:w16se="http://schemas.microsoft.com/office/word/2015/wordml/symex" xmlns:w16du="http://schemas.microsoft.com/office/word/2023/wordml/word16du" xmlns:wne="http://schemas.microsoft.com/office/word/2006/wordml" mc:Ignorable="w14 w15 w16se w16cid w16 w16cex w16sdtdh w16sdtfl w16du wp14">
   <w:endnote w:type="separator" w:id="-1">
     <w:p>
       <w:r>
@@ -3751,7 +3071,7 @@
 </file>
 
 <file path=word/footer1.xml><?xml version="1.0" encoding="utf-8"?>
-<w:ftr xmlns:wpc="http://schemas.microsoft.com/office/word/2010/wordprocessingCanvas" xmlns:cx="http://schemas.microsoft.com/office/drawing/2014/chartex" xmlns:cx1="http://schemas.microsoft.com/office/drawing/2015/9/8/chartex" xmlns:cx2="http://schemas.microsoft.com/office/drawing/2015/10/21/chartex" xmlns:cx3="http://schemas.microsoft.com/office/drawing/2016/5/9/chartex" xmlns:cx4="http://schemas.microsoft.com/office/drawing/2016/5/10/chartex" xmlns:cx5="http://schemas.microsoft.com/office/drawing/2016/5/11/chartex" xmlns:cx6="http://schemas.microsoft.com/office/drawing/2016/5/12/chartex" xmlns:cx7="http://schemas.microsoft.com/office/drawing/2016/5/13/chartex" xmlns:cx8="http://schemas.microsoft.com/office/drawing/2016/5/14/chartex" xmlns:mc="http://schemas.openxmlformats.org/markup-compatibility/2006" xmlns:aink="http://schemas.microsoft.com/office/drawing/2016/ink" xmlns:am3d="http://schemas.microsoft.com/office/drawing/2017/model3d" xmlns:o="urn:schemas-microsoft-com:office:office" xmlns:oel="http://schemas.microsoft.com/office/2019/extlst" xmlns:r="http://schemas.openxmlformats.org/officeDocument/2006/relationships" xmlns:m="http://schemas.openxmlformats.org/officeDocument/2006/math" xmlns:v="urn:schemas-microsoft-com:vml" xmlns:wp14="http://schemas.microsoft.com/office/word/2010/wordprocessingDrawing" xmlns:wp="http://schemas.openxmlformats.org/drawingml/2006/wordprocessingDrawing" xmlns:w10="urn:schemas-microsoft-com:office:word" xmlns:w="http://schemas.openxmlformats.org/wordprocessingml/2006/main" xmlns:w14="http://schemas.microsoft.com/office/word/2010/wordml" xmlns:w15="http://schemas.microsoft.com/office/word/2012/wordml" xmlns:w16cex="http://schemas.microsoft.com/office/word/2018/wordml/cex" xmlns:w16cid="http://schemas.microsoft.com/office/word/2016/wordml/cid" xmlns:w16="http://schemas.microsoft.com/office/word/2018/wordml" xmlns:w16du="http://schemas.microsoft.com/office/word/2023/wordml/word16du" xmlns:w16sdtdh="http://schemas.microsoft.com/office/word/2020/wordml/sdtdatahash" xmlns:w16sdtfl="http://schemas.microsoft.com/office/word/2024/wordml/sdtformatlock" xmlns:w16se="http://schemas.microsoft.com/office/word/2015/wordml/symex" xmlns:wpg="http://schemas.microsoft.com/office/word/2010/wordprocessingGroup" xmlns:wpi="http://schemas.microsoft.com/office/word/2010/wordprocessingInk" xmlns:wne="http://schemas.microsoft.com/office/word/2006/wordml" xmlns:wps="http://schemas.microsoft.com/office/word/2010/wordprocessingShape" mc:Ignorable="w14 w15 w16se w16cid w16 w16cex w16sdtdh w16sdtfl w16du wp14">
+<w:ftr xmlns:wpc="http://schemas.microsoft.com/office/word/2010/wordprocessingCanvas" xmlns:cx="http://schemas.microsoft.com/office/drawing/2014/chartex" xmlns:cx1="http://schemas.microsoft.com/office/drawing/2015/9/8/chartex" xmlns:cx2="http://schemas.microsoft.com/office/drawing/2015/10/21/chartex" xmlns:cx3="http://schemas.microsoft.com/office/drawing/2016/5/9/chartex" xmlns:cx4="http://schemas.microsoft.com/office/drawing/2016/5/10/chartex" xmlns:cx5="http://schemas.microsoft.com/office/drawing/2016/5/11/chartex" xmlns:cx6="http://schemas.microsoft.com/office/drawing/2016/5/12/chartex" xmlns:cx7="http://schemas.microsoft.com/office/drawing/2016/5/13/chartex" xmlns:cx8="http://schemas.microsoft.com/office/drawing/2016/5/14/chartex" xmlns:mc="http://schemas.openxmlformats.org/markup-compatibility/2006" xmlns:m="http://schemas.openxmlformats.org/officeDocument/2006/math" xmlns:aink="http://schemas.microsoft.com/office/drawing/2016/ink" xmlns:am3d="http://schemas.microsoft.com/office/drawing/2017/model3d" xmlns:oel="http://schemas.microsoft.com/office/2019/extlst" xmlns:r="http://schemas.openxmlformats.org/officeDocument/2006/relationships" xmlns:wp14="http://schemas.microsoft.com/office/word/2010/wordprocessingDrawing" xmlns:wp="http://schemas.openxmlformats.org/drawingml/2006/wordprocessingDrawing" xmlns:wpg="http://schemas.microsoft.com/office/word/2010/wordprocessingGroup" xmlns:wpi="http://schemas.microsoft.com/office/word/2010/wordprocessingInk" xmlns:wps="http://schemas.microsoft.com/office/word/2010/wordprocessingShape" xmlns:o="urn:schemas-microsoft-com:office:office" xmlns:v="urn:schemas-microsoft-com:vml" xmlns:w10="urn:schemas-microsoft-com:office:word" xmlns:w="http://schemas.openxmlformats.org/wordprocessingml/2006/main" xmlns:w14="http://schemas.microsoft.com/office/word/2010/wordml" xmlns:w15="http://schemas.microsoft.com/office/word/2012/wordml" xmlns:w16cex="http://schemas.microsoft.com/office/word/2018/wordml/cex" xmlns:w16cid="http://schemas.microsoft.com/office/word/2016/wordml/cid" xmlns:w16="http://schemas.microsoft.com/office/word/2018/wordml" xmlns:w16sdtdh="http://schemas.microsoft.com/office/word/2020/wordml/sdtdatahash" xmlns:w16sdtfl="http://schemas.microsoft.com/office/word/2024/wordml/sdtformatlock" xmlns:w16se="http://schemas.microsoft.com/office/word/2015/wordml/symex" xmlns:w16du="http://schemas.microsoft.com/office/word/2023/wordml/word16du" xmlns:wne="http://schemas.microsoft.com/office/word/2006/wordml" mc:Ignorable="w14 w15 w16se w16cid w16 w16cex w16sdtdh w16sdtfl w16du wp14">
   <w:p>
     <w:pPr>
       <w:jc w:val="right"/>
@@ -3802,7 +3122,7 @@
 </file>
 
 <file path=word/footnotes.xml><?xml version="1.0" encoding="utf-8"?>
-<w:footnotes xmlns:wpc="http://schemas.microsoft.com/office/word/2010/wordprocessingCanvas" xmlns:cx="http://schemas.microsoft.com/office/drawing/2014/chartex" xmlns:cx1="http://schemas.microsoft.com/office/drawing/2015/9/8/chartex" xmlns:cx2="http://schemas.microsoft.com/office/drawing/2015/10/21/chartex" xmlns:cx3="http://schemas.microsoft.com/office/drawing/2016/5/9/chartex" xmlns:cx4="http://schemas.microsoft.com/office/drawing/2016/5/10/chartex" xmlns:cx5="http://schemas.microsoft.com/office/drawing/2016/5/11/chartex" xmlns:cx6="http://schemas.microsoft.com/office/drawing/2016/5/12/chartex" xmlns:cx7="http://schemas.microsoft.com/office/drawing/2016/5/13/chartex" xmlns:cx8="http://schemas.microsoft.com/office/drawing/2016/5/14/chartex" xmlns:mc="http://schemas.openxmlformats.org/markup-compatibility/2006" xmlns:aink="http://schemas.microsoft.com/office/drawing/2016/ink" xmlns:am3d="http://schemas.microsoft.com/office/drawing/2017/model3d" xmlns:o="urn:schemas-microsoft-com:office:office" xmlns:oel="http://schemas.microsoft.com/office/2019/extlst" xmlns:r="http://schemas.openxmlformats.org/officeDocument/2006/relationships" xmlns:m="http://schemas.openxmlformats.org/officeDocument/2006/math" xmlns:v="urn:schemas-microsoft-com:vml" xmlns:wp14="http://schemas.microsoft.com/office/word/2010/wordprocessingDrawing" xmlns:wp="http://schemas.openxmlformats.org/drawingml/2006/wordprocessingDrawing" xmlns:w10="urn:schemas-microsoft-com:office:word" xmlns:w="http://schemas.openxmlformats.org/wordprocessingml/2006/main" xmlns:w14="http://schemas.microsoft.com/office/word/2010/wordml" xmlns:w15="http://schemas.microsoft.com/office/word/2012/wordml" xmlns:w16cex="http://schemas.microsoft.com/office/word/2018/wordml/cex" xmlns:w16cid="http://schemas.microsoft.com/office/word/2016/wordml/cid" xmlns:w16="http://schemas.microsoft.com/office/word/2018/wordml" xmlns:w16du="http://schemas.microsoft.com/office/word/2023/wordml/word16du" xmlns:w16sdtdh="http://schemas.microsoft.com/office/word/2020/wordml/sdtdatahash" xmlns:w16sdtfl="http://schemas.microsoft.com/office/word/2024/wordml/sdtformatlock" xmlns:w16se="http://schemas.microsoft.com/office/word/2015/wordml/symex" xmlns:wpg="http://schemas.microsoft.com/office/word/2010/wordprocessingGroup" xmlns:wpi="http://schemas.microsoft.com/office/word/2010/wordprocessingInk" xmlns:wne="http://schemas.microsoft.com/office/word/2006/wordml" xmlns:wps="http://schemas.microsoft.com/office/word/2010/wordprocessingShape" mc:Ignorable="w14 w15 w16se w16cid w16 w16cex w16sdtdh w16sdtfl w16du wp14">
+<w:footnotes xmlns:wpc="http://schemas.microsoft.com/office/word/2010/wordprocessingCanvas" xmlns:cx="http://schemas.microsoft.com/office/drawing/2014/chartex" xmlns:cx1="http://schemas.microsoft.com/office/drawing/2015/9/8/chartex" xmlns:cx2="http://schemas.microsoft.com/office/drawing/2015/10/21/chartex" xmlns:cx3="http://schemas.microsoft.com/office/drawing/2016/5/9/chartex" xmlns:cx4="http://schemas.microsoft.com/office/drawing/2016/5/10/chartex" xmlns:cx5="http://schemas.microsoft.com/office/drawing/2016/5/11/chartex" xmlns:cx6="http://schemas.microsoft.com/office/drawing/2016/5/12/chartex" xmlns:cx7="http://schemas.microsoft.com/office/drawing/2016/5/13/chartex" xmlns:cx8="http://schemas.microsoft.com/office/drawing/2016/5/14/chartex" xmlns:mc="http://schemas.openxmlformats.org/markup-compatibility/2006" xmlns:m="http://schemas.openxmlformats.org/officeDocument/2006/math" xmlns:aink="http://schemas.microsoft.com/office/drawing/2016/ink" xmlns:am3d="http://schemas.microsoft.com/office/drawing/2017/model3d" xmlns:oel="http://schemas.microsoft.com/office/2019/extlst" xmlns:r="http://schemas.openxmlformats.org/officeDocument/2006/relationships" xmlns:wp14="http://schemas.microsoft.com/office/word/2010/wordprocessingDrawing" xmlns:wp="http://schemas.openxmlformats.org/drawingml/2006/wordprocessingDrawing" xmlns:wpg="http://schemas.microsoft.com/office/word/2010/wordprocessingGroup" xmlns:wpi="http://schemas.microsoft.com/office/word/2010/wordprocessingInk" xmlns:wps="http://schemas.microsoft.com/office/word/2010/wordprocessingShape" xmlns:o="urn:schemas-microsoft-com:office:office" xmlns:v="urn:schemas-microsoft-com:vml" xmlns:w10="urn:schemas-microsoft-com:office:word" xmlns:w="http://schemas.openxmlformats.org/wordprocessingml/2006/main" xmlns:w14="http://schemas.microsoft.com/office/word/2010/wordml" xmlns:w15="http://schemas.microsoft.com/office/word/2012/wordml" xmlns:w16cex="http://schemas.microsoft.com/office/word/2018/wordml/cex" xmlns:w16cid="http://schemas.microsoft.com/office/word/2016/wordml/cid" xmlns:w16="http://schemas.microsoft.com/office/word/2018/wordml" xmlns:w16sdtdh="http://schemas.microsoft.com/office/word/2020/wordml/sdtdatahash" xmlns:w16sdtfl="http://schemas.microsoft.com/office/word/2024/wordml/sdtformatlock" xmlns:w16se="http://schemas.microsoft.com/office/word/2015/wordml/symex" xmlns:w16du="http://schemas.microsoft.com/office/word/2023/wordml/word16du" xmlns:wne="http://schemas.microsoft.com/office/word/2006/wordml" mc:Ignorable="w14 w15 w16se w16cid w16 w16cex w16sdtdh w16sdtfl w16du wp14">
   <w:footnote w:type="separator" w:id="-1">
     <w:p>
       <w:r>
@@ -3821,7 +3141,7 @@
 </file>
 
 <file path=word/numbering.xml><?xml version="1.0" encoding="utf-8"?>
-<w:numbering xmlns:wpc="http://schemas.microsoft.com/office/word/2010/wordprocessingCanvas" xmlns:cx="http://schemas.microsoft.com/office/drawing/2014/chartex" xmlns:cx1="http://schemas.microsoft.com/office/drawing/2015/9/8/chartex" xmlns:cx2="http://schemas.microsoft.com/office/drawing/2015/10/21/chartex" xmlns:cx3="http://schemas.microsoft.com/office/drawing/2016/5/9/chartex" xmlns:cx4="http://schemas.microsoft.com/office/drawing/2016/5/10/chartex" xmlns:cx5="http://schemas.microsoft.com/office/drawing/2016/5/11/chartex" xmlns:cx6="http://schemas.microsoft.com/office/drawing/2016/5/12/chartex" xmlns:cx7="http://schemas.microsoft.com/office/drawing/2016/5/13/chartex" xmlns:cx8="http://schemas.microsoft.com/office/drawing/2016/5/14/chartex" xmlns:mc="http://schemas.openxmlformats.org/markup-compatibility/2006" xmlns:aink="http://schemas.microsoft.com/office/drawing/2016/ink" xmlns:am3d="http://schemas.microsoft.com/office/drawing/2017/model3d" xmlns:o="urn:schemas-microsoft-com:office:office" xmlns:oel="http://schemas.microsoft.com/office/2019/extlst" xmlns:r="http://schemas.openxmlformats.org/officeDocument/2006/relationships" xmlns:m="http://schemas.openxmlformats.org/officeDocument/2006/math" xmlns:v="urn:schemas-microsoft-com:vml" xmlns:wp14="http://schemas.microsoft.com/office/word/2010/wordprocessingDrawing" xmlns:wp="http://schemas.openxmlformats.org/drawingml/2006/wordprocessingDrawing" xmlns:w10="urn:schemas-microsoft-com:office:word" xmlns:w="http://schemas.openxmlformats.org/wordprocessingml/2006/main" xmlns:w14="http://schemas.microsoft.com/office/word/2010/wordml" xmlns:w15="http://schemas.microsoft.com/office/word/2012/wordml" xmlns:w16cex="http://schemas.microsoft.com/office/word/2018/wordml/cex" xmlns:w16cid="http://schemas.microsoft.com/office/word/2016/wordml/cid" xmlns:w16="http://schemas.microsoft.com/office/word/2018/wordml" xmlns:w16du="http://schemas.microsoft.com/office/word/2023/wordml/word16du" xmlns:w16sdtdh="http://schemas.microsoft.com/office/word/2020/wordml/sdtdatahash" xmlns:w16sdtfl="http://schemas.microsoft.com/office/word/2024/wordml/sdtformatlock" xmlns:w16se="http://schemas.microsoft.com/office/word/2015/wordml/symex" xmlns:wpg="http://schemas.microsoft.com/office/word/2010/wordprocessingGroup" xmlns:wpi="http://schemas.microsoft.com/office/word/2010/wordprocessingInk" xmlns:wne="http://schemas.microsoft.com/office/word/2006/wordml" xmlns:wps="http://schemas.microsoft.com/office/word/2010/wordprocessingShape" mc:Ignorable="w14 w15 w16se w16cid w16 w16cex w16sdtdh w16sdtfl w16du wp14">
+<w:numbering xmlns:wpc="http://schemas.microsoft.com/office/word/2010/wordprocessingCanvas" xmlns:cx="http://schemas.microsoft.com/office/drawing/2014/chartex" xmlns:cx1="http://schemas.microsoft.com/office/drawing/2015/9/8/chartex" xmlns:cx2="http://schemas.microsoft.com/office/drawing/2015/10/21/chartex" xmlns:cx3="http://schemas.microsoft.com/office/drawing/2016/5/9/chartex" xmlns:cx4="http://schemas.microsoft.com/office/drawing/2016/5/10/chartex" xmlns:cx5="http://schemas.microsoft.com/office/drawing/2016/5/11/chartex" xmlns:cx6="http://schemas.microsoft.com/office/drawing/2016/5/12/chartex" xmlns:cx7="http://schemas.microsoft.com/office/drawing/2016/5/13/chartex" xmlns:cx8="http://schemas.microsoft.com/office/drawing/2016/5/14/chartex" xmlns:mc="http://schemas.openxmlformats.org/markup-compatibility/2006" xmlns:m="http://schemas.openxmlformats.org/officeDocument/2006/math" xmlns:aink="http://schemas.microsoft.com/office/drawing/2016/ink" xmlns:am3d="http://schemas.microsoft.com/office/drawing/2017/model3d" xmlns:oel="http://schemas.microsoft.com/office/2019/extlst" xmlns:r="http://schemas.openxmlformats.org/officeDocument/2006/relationships" xmlns:wp14="http://schemas.microsoft.com/office/word/2010/wordprocessingDrawing" xmlns:wp="http://schemas.openxmlformats.org/drawingml/2006/wordprocessingDrawing" xmlns:wpg="http://schemas.microsoft.com/office/word/2010/wordprocessingGroup" xmlns:wpi="http://schemas.microsoft.com/office/word/2010/wordprocessingInk" xmlns:wps="http://schemas.microsoft.com/office/word/2010/wordprocessingShape" xmlns:o="urn:schemas-microsoft-com:office:office" xmlns:v="urn:schemas-microsoft-com:vml" xmlns:w10="urn:schemas-microsoft-com:office:word" xmlns:w="http://schemas.openxmlformats.org/wordprocessingml/2006/main" xmlns:w14="http://schemas.microsoft.com/office/word/2010/wordml" xmlns:w15="http://schemas.microsoft.com/office/word/2012/wordml" xmlns:w16cex="http://schemas.microsoft.com/office/word/2018/wordml/cex" xmlns:w16cid="http://schemas.microsoft.com/office/word/2016/wordml/cid" xmlns:w16="http://schemas.microsoft.com/office/word/2018/wordml" xmlns:w16sdtdh="http://schemas.microsoft.com/office/word/2020/wordml/sdtdatahash" xmlns:w16sdtfl="http://schemas.microsoft.com/office/word/2024/wordml/sdtformatlock" xmlns:w16se="http://schemas.microsoft.com/office/word/2015/wordml/symex" xmlns:w16du="http://schemas.microsoft.com/office/word/2023/wordml/word16du" xmlns:wne="http://schemas.microsoft.com/office/word/2006/wordml" mc:Ignorable="w14 w15 w16se w16cid w16 w16cex w16sdtdh w16sdtfl w16du wp14">
   <w:abstractNum w:abstractNumId="0" w15:restartNumberingAfterBreak="0">
     <w:nsid w:val="0A547067"/>
     <w:multiLevelType w:val="hybridMultilevel"/>
@@ -3918,7 +3238,7 @@
 </file>
 
 <file path=word/styles.xml><?xml version="1.0" encoding="utf-8"?>
-<w:styles xmlns:mc="http://schemas.openxmlformats.org/markup-compatibility/2006" xmlns:r="http://schemas.openxmlformats.org/officeDocument/2006/relationships" xmlns:w="http://schemas.openxmlformats.org/wordprocessingml/2006/main" xmlns:w14="http://schemas.microsoft.com/office/word/2010/wordml" xmlns:w15="http://schemas.microsoft.com/office/word/2012/wordml" xmlns:w16cex="http://schemas.microsoft.com/office/word/2018/wordml/cex" xmlns:w16cid="http://schemas.microsoft.com/office/word/2016/wordml/cid" xmlns:w16="http://schemas.microsoft.com/office/word/2018/wordml" xmlns:w16du="http://schemas.microsoft.com/office/word/2023/wordml/word16du" xmlns:w16sdtdh="http://schemas.microsoft.com/office/word/2020/wordml/sdtdatahash" xmlns:w16sdtfl="http://schemas.microsoft.com/office/word/2024/wordml/sdtformatlock" xmlns:w16se="http://schemas.microsoft.com/office/word/2015/wordml/symex" mc:Ignorable="w14 w15 w16se w16cid w16 w16cex w16sdtdh w16sdtfl w16du">
+<w:styles xmlns:mc="http://schemas.openxmlformats.org/markup-compatibility/2006" xmlns:r="http://schemas.openxmlformats.org/officeDocument/2006/relationships" xmlns:w="http://schemas.openxmlformats.org/wordprocessingml/2006/main" xmlns:w14="http://schemas.microsoft.com/office/word/2010/wordml" xmlns:w15="http://schemas.microsoft.com/office/word/2012/wordml" xmlns:w16cex="http://schemas.microsoft.com/office/word/2018/wordml/cex" xmlns:w16cid="http://schemas.microsoft.com/office/word/2016/wordml/cid" xmlns:w16="http://schemas.microsoft.com/office/word/2018/wordml" xmlns:w16sdtdh="http://schemas.microsoft.com/office/word/2020/wordml/sdtdatahash" xmlns:w16sdtfl="http://schemas.microsoft.com/office/word/2024/wordml/sdtformatlock" xmlns:w16se="http://schemas.microsoft.com/office/word/2015/wordml/symex" xmlns:w16du="http://schemas.microsoft.com/office/word/2023/wordml/word16du" mc:Ignorable="w14 w15 w16se w16cid w16 w16cex w16sdtdh w16sdtfl w16du">
   <w:docDefaults>
     <w:rPrDefault>
       <w:rPr>

</xml_diff>

<commit_message>
Actualizar guía de materiales
Se actualiza la guía de materiales del Taller 1 y se elimina el archivo temporal de Microsoft Word generado durante la edición del documento.
</commit_message>
<xml_diff>
--- a/docs/guia_materiales_taller1.docx
+++ b/docs/guia_materiales_taller1.docx
@@ -157,23 +157,7 @@
                 <w:sz w:val="22"/>
                 <w:szCs w:val="22"/>
               </w:rPr>
-              <w:t xml:space="preserve">El archivo .psyexp será completado durante el taller. Al finalizar </w:t>
-            </w:r>
-            <w:r>
-              <w:rPr>
-                <w:color w:val="000000"/>
-                <w:sz w:val="22"/>
-                <w:szCs w:val="22"/>
-              </w:rPr>
-              <w:t>el taller</w:t>
-            </w:r>
-            <w:r>
-              <w:rPr>
-                <w:color w:val="000000"/>
-                <w:sz w:val="22"/>
-                <w:szCs w:val="22"/>
-              </w:rPr>
-              <w:t xml:space="preserve"> se subirá la versión resuelta al repositorio.</w:t>
+              <w:t>Este repositorio se publica al finalizar el taller como material de referencia</w:t>
             </w:r>
           </w:p>
         </w:tc>
@@ -674,7 +658,6 @@
                 <w:szCs w:val="20"/>
                 <w:lang w:val="en-US"/>
               </w:rPr>
-              <w:lastRenderedPageBreak/>
               <w:t>├── media/</w:t>
             </w:r>
           </w:p>
@@ -693,6 +676,7 @@
                 <w:szCs w:val="20"/>
                 <w:lang w:val="en-US"/>
               </w:rPr>
+              <w:lastRenderedPageBreak/>
               <w:t xml:space="preserve">│   ├── anger/    </w:t>
             </w:r>
             <w:proofErr w:type="gramStart"/>
@@ -1808,7 +1792,7 @@
           <w:noProof/>
         </w:rPr>
         <w:drawing>
-          <wp:inline distT="0" distB="0" distL="0" distR="0" wp14:anchorId="261C61F9" wp14:editId="5E2BADFA">
+          <wp:inline distT="0" distB="0" distL="0" distR="0" wp14:anchorId="261C61F9" wp14:editId="3162A6E4">
             <wp:extent cx="5731510" cy="592055"/>
             <wp:effectExtent l="0" t="0" r="2540" b="6985"/>
             <wp:docPr id="100867722" name="Imagen 1"/>
@@ -1957,7 +1941,6 @@
                 <w:sz w:val="22"/>
                 <w:szCs w:val="22"/>
               </w:rPr>
-              <w:lastRenderedPageBreak/>
               <w:t>Columna</w:t>
             </w:r>
           </w:p>
@@ -2020,6 +2003,7 @@
           </w:tcPr>
           <w:p>
             <w:r>
+              <w:lastRenderedPageBreak/>
               <w:t>id_p</w:t>
             </w:r>
           </w:p>
@@ -2794,7 +2778,6 @@
         <w:rPr>
           <w:color w:val="000000"/>
         </w:rPr>
-        <w:lastRenderedPageBreak/>
         <w:t>1.</w:t>
       </w:r>
       <w:r>
@@ -2814,6 +2797,7 @@
         <w:rPr>
           <w:color w:val="000000"/>
         </w:rPr>
+        <w:lastRenderedPageBreak/>
         <w:t>2.</w:t>
       </w:r>
       <w:r>

</xml_diff>

<commit_message>
Agrega secuencias visuales al README del taller
Se añadieron las imágenes de secuencia para la fase práctica y la fase experimental en `media/` y se integraron en `readme.md` con nuevas secciones descriptivas. También se actualizó `docs/guia_materiales_taller1.docx` para mantener la guía del taller alineada con este material visual.
</commit_message>
<xml_diff>
--- a/docs/guia_materiales_taller1.docx
+++ b/docs/guia_materiales_taller1.docx
@@ -95,7 +95,339 @@
     </w:p>
     <w:p>
       <w:pPr>
+        <w:spacing w:before="200" w:after="80" w:line="276" w:lineRule="auto"/>
+        <w:rPr>
+          <w:color w:val="000000"/>
+        </w:rPr>
+      </w:pPr>
+      <w:r>
+        <w:rPr>
+          <w:b/>
+          <w:bCs/>
+          <w:color w:val="000000"/>
+        </w:rPr>
+        <w:t xml:space="preserve">Figura </w:t>
+      </w:r>
+      <w:r>
+        <w:rPr>
+          <w:b/>
+          <w:bCs/>
+          <w:color w:val="000000"/>
+        </w:rPr>
+        <w:t>1</w:t>
+      </w:r>
+    </w:p>
+    <w:p>
+      <w:pPr>
+        <w:spacing w:before="200" w:after="80" w:line="276" w:lineRule="auto"/>
+        <w:rPr>
+          <w:i/>
+          <w:iCs/>
+          <w:color w:val="000000"/>
+        </w:rPr>
+      </w:pPr>
+      <w:r>
+        <w:rPr>
+          <w:i/>
+          <w:iCs/>
+          <w:color w:val="000000"/>
+        </w:rPr>
+        <w:t>Secuencia de fase pr</w:t>
+      </w:r>
+      <w:r>
+        <w:rPr>
+          <w:i/>
+          <w:iCs/>
+          <w:color w:val="000000"/>
+        </w:rPr>
+        <w:t>á</w:t>
+      </w:r>
+      <w:r>
+        <w:rPr>
+          <w:i/>
+          <w:iCs/>
+          <w:color w:val="000000"/>
+        </w:rPr>
+        <w:t>ctica</w:t>
+      </w:r>
+    </w:p>
+    <w:p>
+      <w:pPr>
+        <w:spacing w:before="200" w:after="80" w:line="276" w:lineRule="auto"/>
+        <w:rPr>
+          <w:color w:val="000000"/>
+        </w:rPr>
+      </w:pPr>
+      <w:r>
+        <w:rPr>
+          <w:noProof/>
+          <w:color w:val="000000"/>
+        </w:rPr>
+        <w:drawing>
+          <wp:inline distT="0" distB="0" distL="0" distR="0" wp14:anchorId="2D6057BE" wp14:editId="438B0E75">
+            <wp:extent cx="5731510" cy="1965960"/>
+            <wp:effectExtent l="0" t="0" r="0" b="2540"/>
+            <wp:docPr id="1733432176" name="Imagen 1"/>
+            <wp:cNvGraphicFramePr>
+              <a:graphicFrameLocks xmlns:a="http://schemas.openxmlformats.org/drawingml/2006/main" noChangeAspect="1"/>
+            </wp:cNvGraphicFramePr>
+            <a:graphic xmlns:a="http://schemas.openxmlformats.org/drawingml/2006/main">
+              <a:graphicData uri="http://schemas.openxmlformats.org/drawingml/2006/picture">
+                <pic:pic xmlns:pic="http://schemas.openxmlformats.org/drawingml/2006/picture">
+                  <pic:nvPicPr>
+                    <pic:cNvPr id="1733432176" name="Imagen 1733432176"/>
+                    <pic:cNvPicPr/>
+                  </pic:nvPicPr>
+                  <pic:blipFill>
+                    <a:blip r:embed="rId7" cstate="print">
+                      <a:extLst>
+                        <a:ext uri="{28A0092B-C50C-407E-A947-70E740481C1C}">
+                          <a14:useLocalDpi xmlns:a14="http://schemas.microsoft.com/office/drawing/2010/main" val="0"/>
+                        </a:ext>
+                      </a:extLst>
+                    </a:blip>
+                    <a:stretch>
+                      <a:fillRect/>
+                    </a:stretch>
+                  </pic:blipFill>
+                  <pic:spPr>
+                    <a:xfrm>
+                      <a:off x="0" y="0"/>
+                      <a:ext cx="5731510" cy="1965960"/>
+                    </a:xfrm>
+                    <a:prstGeom prst="rect">
+                      <a:avLst/>
+                    </a:prstGeom>
+                  </pic:spPr>
+                </pic:pic>
+              </a:graphicData>
+            </a:graphic>
+          </wp:inline>
+        </w:drawing>
+      </w:r>
+    </w:p>
+    <w:p>
+      <w:pPr>
+        <w:spacing w:before="200" w:after="80" w:line="276" w:lineRule="auto"/>
+        <w:rPr>
+          <w:color w:val="000000"/>
+        </w:rPr>
+      </w:pPr>
+      <w:r>
+        <w:rPr>
+          <w:b/>
+          <w:bCs/>
+          <w:color w:val="000000"/>
+        </w:rPr>
+        <w:t xml:space="preserve">Figura </w:t>
+      </w:r>
+      <w:r>
+        <w:rPr>
+          <w:b/>
+          <w:bCs/>
+          <w:color w:val="000000"/>
+        </w:rPr>
+        <w:t>2</w:t>
+      </w:r>
+    </w:p>
+    <w:p>
+      <w:pPr>
+        <w:spacing w:before="200" w:after="80" w:line="276" w:lineRule="auto"/>
+        <w:rPr>
+          <w:i/>
+          <w:iCs/>
+          <w:color w:val="000000"/>
+        </w:rPr>
+      </w:pPr>
+      <w:r>
+        <w:rPr>
+          <w:i/>
+          <w:iCs/>
+          <w:color w:val="000000"/>
+        </w:rPr>
+        <w:t>Secuencia de fase experimental</w:t>
+      </w:r>
+    </w:p>
+    <w:p>
+      <w:pPr>
+        <w:spacing w:before="200" w:after="80" w:line="276" w:lineRule="auto"/>
+        <w:rPr>
+          <w:color w:val="000000"/>
+        </w:rPr>
+      </w:pPr>
+      <w:r>
+        <w:rPr>
+          <w:noProof/>
+          <w:color w:val="000000"/>
+        </w:rPr>
+        <w:drawing>
+          <wp:inline distT="0" distB="0" distL="0" distR="0" wp14:anchorId="6DED3E2C" wp14:editId="370485BA">
+            <wp:extent cx="5731510" cy="1965960"/>
+            <wp:effectExtent l="0" t="0" r="0" b="2540"/>
+            <wp:docPr id="998600642" name="Imagen 2"/>
+            <wp:cNvGraphicFramePr>
+              <a:graphicFrameLocks xmlns:a="http://schemas.openxmlformats.org/drawingml/2006/main" noChangeAspect="1"/>
+            </wp:cNvGraphicFramePr>
+            <a:graphic xmlns:a="http://schemas.openxmlformats.org/drawingml/2006/main">
+              <a:graphicData uri="http://schemas.openxmlformats.org/drawingml/2006/picture">
+                <pic:pic xmlns:pic="http://schemas.openxmlformats.org/drawingml/2006/picture">
+                  <pic:nvPicPr>
+                    <pic:cNvPr id="998600642" name="Imagen 998600642"/>
+                    <pic:cNvPicPr/>
+                  </pic:nvPicPr>
+                  <pic:blipFill>
+                    <a:blip r:embed="rId8" cstate="print">
+                      <a:extLst>
+                        <a:ext uri="{28A0092B-C50C-407E-A947-70E740481C1C}">
+                          <a14:useLocalDpi xmlns:a14="http://schemas.microsoft.com/office/drawing/2010/main" val="0"/>
+                        </a:ext>
+                      </a:extLst>
+                    </a:blip>
+                    <a:stretch>
+                      <a:fillRect/>
+                    </a:stretch>
+                  </pic:blipFill>
+                  <pic:spPr>
+                    <a:xfrm>
+                      <a:off x="0" y="0"/>
+                      <a:ext cx="5731510" cy="1965960"/>
+                    </a:xfrm>
+                    <a:prstGeom prst="rect">
+                      <a:avLst/>
+                    </a:prstGeom>
+                  </pic:spPr>
+                </pic:pic>
+              </a:graphicData>
+            </a:graphic>
+          </wp:inline>
+        </w:drawing>
+      </w:r>
+      <w:r>
+        <w:rPr>
+          <w:b/>
+          <w:bCs/>
+          <w:color w:val="000000"/>
+        </w:rPr>
+        <w:t>2. Cómo descargar los materiales</w:t>
+      </w:r>
+    </w:p>
+    <w:p>
+      <w:pPr>
+        <w:spacing w:after="120" w:line="276" w:lineRule="auto"/>
+        <w:jc w:val="both"/>
+      </w:pPr>
+      <w:r>
+        <w:rPr>
+          <w:color w:val="000000"/>
+        </w:rPr>
+        <w:t>Seguir los siguientes pasos para obtener todos los archivos necesarios antes del taller:</w:t>
+      </w:r>
+    </w:p>
+    <w:p>
+      <w:pPr>
+        <w:spacing w:before="40" w:after="40" w:line="276" w:lineRule="auto"/>
+        <w:ind w:left="720" w:hanging="360"/>
+        <w:jc w:val="both"/>
+      </w:pPr>
+      <w:r>
+        <w:rPr>
+          <w:color w:val="000000"/>
+        </w:rPr>
+        <w:t>1.</w:t>
+      </w:r>
+      <w:r>
+        <w:rPr>
+          <w:color w:val="000000"/>
+        </w:rPr>
+        <w:tab/>
+        <w:t>Ingresar al repositorio del taller en GitHub.</w:t>
+      </w:r>
+    </w:p>
+    <w:p>
+      <w:pPr>
+        <w:spacing w:before="40" w:after="40" w:line="276" w:lineRule="auto"/>
+        <w:ind w:left="720" w:hanging="360"/>
+        <w:jc w:val="both"/>
+      </w:pPr>
+      <w:r>
+        <w:rPr>
+          <w:color w:val="000000"/>
+        </w:rPr>
+        <w:t>2.</w:t>
+      </w:r>
+      <w:r>
+        <w:rPr>
+          <w:color w:val="000000"/>
+        </w:rPr>
+        <w:tab/>
+        <w:t>Hacer clic en el botón verde Code en la parte superior de la página.</w:t>
+      </w:r>
+    </w:p>
+    <w:p>
+      <w:pPr>
+        <w:spacing w:before="40" w:after="40" w:line="276" w:lineRule="auto"/>
+        <w:ind w:left="720" w:hanging="360"/>
+        <w:jc w:val="both"/>
+      </w:pPr>
+      <w:r>
+        <w:rPr>
+          <w:color w:val="000000"/>
+        </w:rPr>
+        <w:lastRenderedPageBreak/>
+        <w:t>3.</w:t>
+      </w:r>
+      <w:r>
+        <w:rPr>
+          <w:color w:val="000000"/>
+        </w:rPr>
+        <w:tab/>
+        <w:t>Seleccionar Download ZIP.</w:t>
+      </w:r>
+    </w:p>
+    <w:p>
+      <w:pPr>
+        <w:spacing w:before="40" w:after="40" w:line="276" w:lineRule="auto"/>
+        <w:ind w:left="720" w:hanging="360"/>
+        <w:jc w:val="both"/>
+      </w:pPr>
+      <w:r>
+        <w:rPr>
+          <w:color w:val="000000"/>
+        </w:rPr>
+        <w:t>4.</w:t>
+      </w:r>
+      <w:r>
+        <w:rPr>
+          <w:color w:val="000000"/>
+        </w:rPr>
+        <w:tab/>
+        <w:t>Descomprimir el archivo en la computadora.</w:t>
+      </w:r>
+    </w:p>
+    <w:p>
+      <w:pPr>
+        <w:spacing w:before="40" w:after="40" w:line="276" w:lineRule="auto"/>
+        <w:ind w:left="720" w:hanging="360"/>
+        <w:jc w:val="both"/>
+      </w:pPr>
+      <w:r>
+        <w:rPr>
+          <w:color w:val="000000"/>
+        </w:rPr>
+        <w:t>5.</w:t>
+      </w:r>
+      <w:r>
+        <w:rPr>
+          <w:color w:val="000000"/>
+        </w:rPr>
+        <w:tab/>
+        <w:t>Abrir PsychoPy Builder y cargar el archivo categorizacion_emocional.psyexp.</w:t>
+      </w:r>
+    </w:p>
+    <w:p>
+      <w:pPr>
         <w:spacing w:before="80"/>
+        <w:jc w:val="both"/>
       </w:pPr>
     </w:p>
     <w:tbl>
@@ -157,7 +489,7 @@
                 <w:sz w:val="22"/>
                 <w:szCs w:val="22"/>
               </w:rPr>
-              <w:t>Este repositorio se publica al finalizar el taller como material de referencia</w:t>
+              <w:t>No mover ni renombrar ninguna carpeta. PsychoPy necesita encontrar los archivos exactamente en las rutas que se configurarán durante el taller.</w:t>
             </w:r>
           </w:p>
         </w:tc>
@@ -174,7 +506,7 @@
           <w:bCs/>
           <w:color w:val="000000"/>
         </w:rPr>
-        <w:t>2. Cómo descargar los materiales</w:t>
+        <w:t>3. Estructura del repositorio</w:t>
       </w:r>
     </w:p>
     <w:p>
@@ -186,114 +518,8 @@
         <w:rPr>
           <w:color w:val="000000"/>
         </w:rPr>
-        <w:t>Seguir los siguientes pasos para obtener todos los archivos necesarios antes del taller:</w:t>
-      </w:r>
-    </w:p>
-    <w:p>
-      <w:pPr>
-        <w:spacing w:before="40" w:after="40" w:line="276" w:lineRule="auto"/>
-        <w:ind w:left="720" w:hanging="360"/>
-        <w:jc w:val="both"/>
-      </w:pPr>
-      <w:r>
-        <w:rPr>
-          <w:color w:val="000000"/>
-        </w:rPr>
-        <w:t>1.</w:t>
-      </w:r>
-      <w:r>
-        <w:rPr>
-          <w:color w:val="000000"/>
-        </w:rPr>
-        <w:tab/>
-        <w:t>Ingresar al repositorio del taller en GitHub.</w:t>
-      </w:r>
-    </w:p>
-    <w:p>
-      <w:pPr>
-        <w:spacing w:before="40" w:after="40" w:line="276" w:lineRule="auto"/>
-        <w:ind w:left="720" w:hanging="360"/>
-        <w:jc w:val="both"/>
-      </w:pPr>
-      <w:r>
-        <w:rPr>
-          <w:color w:val="000000"/>
-        </w:rPr>
-        <w:t>2.</w:t>
-      </w:r>
-      <w:r>
-        <w:rPr>
-          <w:color w:val="000000"/>
-        </w:rPr>
-        <w:tab/>
-        <w:t>Hacer clic en el botón verde Code en la parte superior de la página.</w:t>
-      </w:r>
-    </w:p>
-    <w:p>
-      <w:pPr>
-        <w:spacing w:before="40" w:after="40" w:line="276" w:lineRule="auto"/>
-        <w:ind w:left="720" w:hanging="360"/>
-        <w:jc w:val="both"/>
-      </w:pPr>
-      <w:r>
-        <w:rPr>
-          <w:color w:val="000000"/>
-        </w:rPr>
-        <w:t>3.</w:t>
-      </w:r>
-      <w:r>
-        <w:rPr>
-          <w:color w:val="000000"/>
-        </w:rPr>
-        <w:tab/>
-        <w:t>Seleccionar Download ZIP.</w:t>
-      </w:r>
-    </w:p>
-    <w:p>
-      <w:pPr>
-        <w:spacing w:before="40" w:after="40" w:line="276" w:lineRule="auto"/>
-        <w:ind w:left="720" w:hanging="360"/>
-        <w:jc w:val="both"/>
-      </w:pPr>
-      <w:r>
-        <w:rPr>
-          <w:color w:val="000000"/>
-        </w:rPr>
-        <w:t>4.</w:t>
-      </w:r>
-      <w:r>
-        <w:rPr>
-          <w:color w:val="000000"/>
-        </w:rPr>
-        <w:tab/>
-        <w:t>Descomprimir el archivo en la computadora.</w:t>
-      </w:r>
-    </w:p>
-    <w:p>
-      <w:pPr>
-        <w:spacing w:before="40" w:after="40" w:line="276" w:lineRule="auto"/>
-        <w:ind w:left="720" w:hanging="360"/>
-        <w:jc w:val="both"/>
-      </w:pPr>
-      <w:r>
-        <w:rPr>
-          <w:color w:val="000000"/>
-        </w:rPr>
-        <w:t>5.</w:t>
-      </w:r>
-      <w:r>
-        <w:rPr>
-          <w:color w:val="000000"/>
-        </w:rPr>
-        <w:tab/>
-        <w:t>Abrir PsychoPy Builder y cargar el archivo categorizacion_emocional.psyexp.</w:t>
-      </w:r>
-    </w:p>
-    <w:p>
-      <w:pPr>
-        <w:spacing w:before="80"/>
-        <w:jc w:val="both"/>
-      </w:pPr>
+        <w:t>Una vez descomprimido el archivo ZIP, la estructura de carpetas debe ser la siguiente:</w:t>
+      </w:r>
     </w:p>
     <w:tbl>
       <w:tblPr>
@@ -325,97 +551,6 @@
               <w:bottom w:val="single" w:sz="4" w:space="0" w:color="AAAAAA"/>
               <w:right w:val="single" w:sz="4" w:space="0" w:color="AAAAAA"/>
             </w:tcBorders>
-            <w:shd w:val="clear" w:color="auto" w:fill="FFFFFF"/>
-            <w:tcMar>
-              <w:top w:w="120" w:type="dxa"/>
-              <w:left w:w="240" w:type="dxa"/>
-              <w:bottom w:w="120" w:type="dxa"/>
-              <w:right w:w="240" w:type="dxa"/>
-            </w:tcMar>
-          </w:tcPr>
-          <w:p>
-            <w:pPr>
-              <w:spacing w:line="276" w:lineRule="auto"/>
-              <w:jc w:val="both"/>
-            </w:pPr>
-            <w:r>
-              <w:rPr>
-                <w:b/>
-                <w:bCs/>
-                <w:color w:val="000000"/>
-                <w:sz w:val="22"/>
-                <w:szCs w:val="22"/>
-              </w:rPr>
-              <w:t xml:space="preserve">Nota. </w:t>
-            </w:r>
-            <w:r>
-              <w:rPr>
-                <w:color w:val="000000"/>
-                <w:sz w:val="22"/>
-                <w:szCs w:val="22"/>
-              </w:rPr>
-              <w:t>No mover ni renombrar ninguna carpeta. PsychoPy necesita encontrar los archivos exactamente en las rutas que se configurarán durante el taller.</w:t>
-            </w:r>
-          </w:p>
-        </w:tc>
-      </w:tr>
-    </w:tbl>
-    <w:p>
-      <w:pPr>
-        <w:spacing w:before="360" w:after="120" w:line="276" w:lineRule="auto"/>
-        <w:jc w:val="both"/>
-      </w:pPr>
-      <w:r>
-        <w:rPr>
-          <w:b/>
-          <w:bCs/>
-          <w:color w:val="000000"/>
-        </w:rPr>
-        <w:t>3. Estructura del repositorio</w:t>
-      </w:r>
-    </w:p>
-    <w:p>
-      <w:pPr>
-        <w:spacing w:after="120" w:line="276" w:lineRule="auto"/>
-        <w:jc w:val="both"/>
-      </w:pPr>
-      <w:r>
-        <w:rPr>
-          <w:color w:val="000000"/>
-        </w:rPr>
-        <w:t>Una vez descomprimido el archivo ZIP, la estructura de carpetas debe ser la siguiente:</w:t>
-      </w:r>
-    </w:p>
-    <w:tbl>
-      <w:tblPr>
-        <w:tblW w:w="9026" w:type="dxa"/>
-        <w:tblBorders>
-          <w:top w:val="single" w:sz="4" w:space="0" w:color="auto"/>
-          <w:left w:val="single" w:sz="4" w:space="0" w:color="auto"/>
-          <w:bottom w:val="single" w:sz="4" w:space="0" w:color="auto"/>
-          <w:right w:val="single" w:sz="4" w:space="0" w:color="auto"/>
-          <w:insideH w:val="single" w:sz="4" w:space="0" w:color="auto"/>
-          <w:insideV w:val="single" w:sz="4" w:space="0" w:color="auto"/>
-        </w:tblBorders>
-        <w:tblCellMar>
-          <w:left w:w="10" w:type="dxa"/>
-          <w:right w:w="10" w:type="dxa"/>
-        </w:tblCellMar>
-        <w:tblLook w:val="0000" w:firstRow="0" w:lastRow="0" w:firstColumn="0" w:lastColumn="0" w:noHBand="0" w:noVBand="0"/>
-      </w:tblPr>
-      <w:tblGrid>
-        <w:gridCol w:w="9026"/>
-      </w:tblGrid>
-      <w:tr>
-        <w:tc>
-          <w:tcPr>
-            <w:tcW w:w="9026" w:type="dxa"/>
-            <w:tcBorders>
-              <w:top w:val="single" w:sz="4" w:space="0" w:color="AAAAAA"/>
-              <w:left w:val="single" w:sz="4" w:space="0" w:color="AAAAAA"/>
-              <w:bottom w:val="single" w:sz="4" w:space="0" w:color="AAAAAA"/>
-              <w:right w:val="single" w:sz="4" w:space="0" w:color="AAAAAA"/>
-            </w:tcBorders>
             <w:shd w:val="clear" w:color="auto" w:fill="F5F5F5"/>
             <w:tcMar>
               <w:top w:w="140" w:type="dxa"/>
@@ -676,7 +811,6 @@
                 <w:szCs w:val="20"/>
                 <w:lang w:val="en-US"/>
               </w:rPr>
-              <w:lastRenderedPageBreak/>
               <w:t xml:space="preserve">│   ├── anger/    </w:t>
             </w:r>
             <w:proofErr w:type="gramStart"/>
@@ -936,7 +1070,6 @@
           <w:bCs/>
           <w:color w:val="000000"/>
         </w:rPr>
-        <w:lastRenderedPageBreak/>
         <w:t>4. Diseño de la tarea</w:t>
       </w:r>
     </w:p>
@@ -1540,6 +1673,7 @@
                 <w:sz w:val="22"/>
                 <w:szCs w:val="22"/>
               </w:rPr>
+              <w:lastRenderedPageBreak/>
               <w:t>ITI</w:t>
             </w:r>
           </w:p>
@@ -1746,25 +1880,19 @@
       </w:pPr>
       <w:r>
         <w:rPr>
-          <w:color w:val="000000"/>
-        </w:rPr>
-        <w:t>Flujo de routines</w:t>
-      </w:r>
-    </w:p>
-    <w:p>
-      <w:pPr>
-        <w:spacing w:before="200" w:after="80" w:line="276" w:lineRule="auto"/>
-        <w:rPr>
-          <w:color w:val="000000"/>
-        </w:rPr>
-      </w:pPr>
-      <w:r>
-        <w:rPr>
           <w:b/>
           <w:bCs/>
           <w:color w:val="000000"/>
         </w:rPr>
-        <w:t>Figura 1</w:t>
+        <w:t xml:space="preserve">Figura </w:t>
+      </w:r>
+      <w:r>
+        <w:rPr>
+          <w:b/>
+          <w:bCs/>
+          <w:color w:val="000000"/>
+        </w:rPr>
+        <w:t>3</w:t>
       </w:r>
     </w:p>
     <w:p>
@@ -1792,7 +1920,7 @@
           <w:noProof/>
         </w:rPr>
         <w:drawing>
-          <wp:inline distT="0" distB="0" distL="0" distR="0" wp14:anchorId="261C61F9" wp14:editId="3162A6E4">
+          <wp:inline distT="0" distB="0" distL="0" distR="0" wp14:anchorId="261C61F9" wp14:editId="000AD71F">
             <wp:extent cx="5731510" cy="592055"/>
             <wp:effectExtent l="0" t="0" r="2540" b="6985"/>
             <wp:docPr id="100867722" name="Imagen 1"/>
@@ -1807,7 +1935,7 @@
                     <pic:cNvPicPr/>
                   </pic:nvPicPr>
                   <pic:blipFill>
-                    <a:blip r:embed="rId7" cstate="print">
+                    <a:blip r:embed="rId9" cstate="print">
                       <a:extLst>
                         <a:ext uri="{28A0092B-C50C-407E-A947-70E740481C1C}">
                           <a14:useLocalDpi xmlns:a14="http://schemas.microsoft.com/office/drawing/2010/main" val="0"/>
@@ -2003,7 +2131,6 @@
           </w:tcPr>
           <w:p>
             <w:r>
-              <w:lastRenderedPageBreak/>
               <w:t>id_p</w:t>
             </w:r>
           </w:p>
@@ -2565,6 +2692,7 @@
           <w:sz w:val="20"/>
           <w:szCs w:val="20"/>
         </w:rPr>
+        <w:lastRenderedPageBreak/>
         <w:t xml:space="preserve">Nota. </w:t>
       </w:r>
       <w:r>
@@ -2747,7 +2875,7 @@
         </w:rPr>
         <w:t xml:space="preserve">Enlace: </w:t>
       </w:r>
-      <w:hyperlink r:id="rId8" w:history="1">
+      <w:hyperlink r:id="rId10" w:history="1">
         <w:r>
           <w:rPr>
             <w:color w:val="1A6B9E"/>
@@ -2797,7 +2925,6 @@
         <w:rPr>
           <w:color w:val="000000"/>
         </w:rPr>
-        <w:lastRenderedPageBreak/>
         <w:t>2.</w:t>
       </w:r>
       <w:r>
@@ -3025,7 +3152,7 @@
       </w:r>
     </w:p>
     <w:sectPr>
-      <w:footerReference w:type="default" r:id="rId9"/>
+      <w:footerReference w:type="default" r:id="rId11"/>
       <w:pgSz w:w="11906" w:h="16838"/>
       <w:pgMar w:top="1440" w:right="1440" w:bottom="1440" w:left="1440" w:header="708" w:footer="708" w:gutter="0"/>
       <w:cols w:space="720"/>

</xml_diff>